<commit_message>
feat: invoice OCR/AI, file folders, ledger pagination, run guide
Read Vietnamese e-invoices with QR, OCR and AI, fill the form as a
proposal only, and let AI check alcohol lines (Tiger + Hà Nội) instead
of inventing a total. Keep one file folder per transaction, paginate
the ledger per user, and add README plus Windows launchers so a clone
can run after PostgreSQL setup and migration 011.

Co-Authored-By: Claude Code <noreply@anthropic.com>
</commit_message>
<xml_diff>
--- a/Mau/tiep khach va thanh toan.docx
+++ b/Mau/tiep khach va thanh toan.docx
@@ -416,6 +416,9 @@
       </w:pPr>
       <w:r>
         <w:rPr>
+          <w:rFonts w:ascii="Times New Roman" w:hAnsi="Times New Roman" w:eastAsia="Times New Roman" w:cs="Times New Roman"/>
+          <w:sz w:val="28"/>
+          <w:szCs w:val="28"/>
           <w:color w:val="000000"/>
         </w:rPr>
         <w:t>Căn cứ văn bản 3358/NHCS-KTTC ngày 01/9/2016 của Tổng Giám đốc về việc Hướng dẫn thực hiện Quy chế quản lý tài chính trong hệ thống Ngân hàng Chính sách xã hội (NHCSXH) và văn bản số 5486/NHCS-KTTC ngày 09/6/2025 sửa đổi một số nội dung của văn bản 3358/NHCS-KTTC.</w:t>
@@ -429,6 +432,9 @@
       </w:pPr>
       <w:r>
         <w:rPr>
+          <w:rFonts w:ascii="Times New Roman" w:hAnsi="Times New Roman" w:eastAsia="Times New Roman" w:cs="Times New Roman"/>
+          <w:sz w:val="28"/>
+          <w:szCs w:val="28"/>
           <w:color w:val="000000"/>
         </w:rPr>
         <w:t>Thực hiện nhiệm vụ được phân công, bộ phận được giao tiếp khách xin lập giấy đề nghị tiếp khách với nội dung cụ thế như sau:</w:t>
@@ -442,18 +448,27 @@
       </w:pPr>
       <w:r>
         <w:rPr>
+          <w:rFonts w:ascii="Times New Roman" w:hAnsi="Times New Roman" w:eastAsia="Times New Roman" w:cs="Times New Roman"/>
+          <w:sz w:val="28"/>
+          <w:szCs w:val="28"/>
           <w:color w:val="000000"/>
         </w:rPr>
         <w:t xml:space="preserve">Đối tượng tiếp khách: </w:t>
       </w:r>
       <w:r>
         <w:rPr>
+          <w:rFonts w:ascii="Times New Roman" w:hAnsi="Times New Roman" w:eastAsia="Times New Roman" w:cs="Times New Roman"/>
+          <w:sz w:val="28"/>
+          <w:szCs w:val="28"/>
           <w:color w:val="000000"/>
         </w:rPr>
         <w:t>[[donvitiepkhac]]</w:t>
       </w:r>
       <w:r>
         <w:rPr>
+          <w:rFonts w:ascii="Times New Roman" w:hAnsi="Times New Roman" w:eastAsia="Times New Roman" w:cs="Times New Roman"/>
+          <w:sz w:val="28"/>
+          <w:szCs w:val="28"/>
           <w:color w:val="000000"/>
         </w:rPr>
         <w:t>.</w:t>
@@ -467,88 +482,117 @@
       </w:pPr>
       <w:r>
         <w:rPr>
+          <w:rFonts w:ascii="Times New Roman" w:hAnsi="Times New Roman" w:eastAsia="Times New Roman" w:cs="Times New Roman"/>
+          <w:sz w:val="28"/>
+          <w:szCs w:val="28"/>
           <w:color w:val="000000"/>
         </w:rPr>
         <w:t xml:space="preserve">Ngày tiếp khách: </w:t>
       </w:r>
       <w:r>
         <w:rPr>
-          <w:rFonts w:ascii="Times New Roman" w:hAnsi="Times New Roman"/>
+          <w:rFonts w:ascii="Times New Roman" w:hAnsi="Times New Roman" w:eastAsia="Times New Roman" w:cs="Times New Roman"/>
+          <w:sz w:val="28"/>
+          <w:szCs w:val="28"/>
           <w:i/>
         </w:rPr>
         <w:t>[[ngay</w:t>
       </w:r>
       <w:r>
         <w:rPr>
-          <w:rFonts w:ascii="Times New Roman" w:hAnsi="Times New Roman"/>
+          <w:rFonts w:ascii="Times New Roman" w:hAnsi="Times New Roman" w:eastAsia="Times New Roman" w:cs="Times New Roman"/>
+          <w:sz w:val="28"/>
+          <w:szCs w:val="28"/>
           <w:i/>
         </w:rPr>
         <w:t>tk</w:t>
       </w:r>
       <w:r>
         <w:rPr>
-          <w:rFonts w:ascii="Times New Roman" w:hAnsi="Times New Roman"/>
+          <w:rFonts w:ascii="Times New Roman" w:hAnsi="Times New Roman" w:eastAsia="Times New Roman" w:cs="Times New Roman"/>
+          <w:sz w:val="28"/>
+          <w:szCs w:val="28"/>
           <w:i/>
         </w:rPr>
         <w:t>]]</w:t>
       </w:r>
       <w:r>
         <w:rPr>
+          <w:rFonts w:ascii="Times New Roman" w:hAnsi="Times New Roman" w:eastAsia="Times New Roman" w:cs="Times New Roman"/>
+          <w:sz w:val="28"/>
+          <w:szCs w:val="28"/>
           <w:color w:val="000000"/>
         </w:rPr>
         <w:t>/</w:t>
       </w:r>
       <w:r>
         <w:rPr>
-          <w:rFonts w:ascii="Times New Roman" w:hAnsi="Times New Roman"/>
+          <w:rFonts w:ascii="Times New Roman" w:hAnsi="Times New Roman" w:eastAsia="Times New Roman" w:cs="Times New Roman"/>
+          <w:sz w:val="28"/>
+          <w:szCs w:val="28"/>
           <w:i/>
         </w:rPr>
         <w:t>[[thang</w:t>
       </w:r>
       <w:r>
         <w:rPr>
-          <w:rFonts w:ascii="Times New Roman" w:hAnsi="Times New Roman"/>
+          <w:rFonts w:ascii="Times New Roman" w:hAnsi="Times New Roman" w:eastAsia="Times New Roman" w:cs="Times New Roman"/>
+          <w:sz w:val="28"/>
+          <w:szCs w:val="28"/>
           <w:i/>
         </w:rPr>
         <w:t>tk</w:t>
       </w:r>
       <w:r>
         <w:rPr>
-          <w:rFonts w:ascii="Times New Roman" w:hAnsi="Times New Roman"/>
+          <w:rFonts w:ascii="Times New Roman" w:hAnsi="Times New Roman" w:eastAsia="Times New Roman" w:cs="Times New Roman"/>
+          <w:sz w:val="28"/>
+          <w:szCs w:val="28"/>
           <w:i/>
         </w:rPr>
         <w:t>]]</w:t>
       </w:r>
       <w:r>
         <w:rPr>
+          <w:rFonts w:ascii="Times New Roman" w:hAnsi="Times New Roman" w:eastAsia="Times New Roman" w:cs="Times New Roman"/>
+          <w:sz w:val="28"/>
+          <w:szCs w:val="28"/>
           <w:color w:val="000000"/>
         </w:rPr>
         <w:t>/</w:t>
       </w:r>
       <w:r>
         <w:rPr>
-          <w:rFonts w:ascii="Times New Roman" w:hAnsi="Times New Roman"/>
+          <w:rFonts w:ascii="Times New Roman" w:hAnsi="Times New Roman" w:eastAsia="Times New Roman" w:cs="Times New Roman"/>
+          <w:sz w:val="28"/>
+          <w:szCs w:val="28"/>
           <w:i/>
         </w:rPr>
         <w:t xml:space="preserve"> </w:t>
       </w:r>
       <w:r>
         <w:rPr>
-          <w:rFonts w:ascii="Times New Roman" w:hAnsi="Times New Roman"/>
+          <w:rFonts w:ascii="Times New Roman" w:hAnsi="Times New Roman" w:eastAsia="Times New Roman" w:cs="Times New Roman"/>
+          <w:sz w:val="28"/>
+          <w:szCs w:val="28"/>
           <w:i/>
         </w:rPr>
         <w:t>[[nam</w:t>
       </w:r>
       <w:r>
         <w:rPr>
-          <w:rFonts w:ascii="Times New Roman" w:hAnsi="Times New Roman"/>
+          <w:rFonts w:ascii="Times New Roman" w:hAnsi="Times New Roman" w:eastAsia="Times New Roman" w:cs="Times New Roman"/>
+          <w:sz w:val="28"/>
+          <w:szCs w:val="28"/>
           <w:i/>
         </w:rPr>
         <w:t>tk</w:t>
       </w:r>
       <w:r>
         <w:rPr>
-          <w:rFonts w:ascii="Times New Roman" w:hAnsi="Times New Roman"/>
+          <w:rFonts w:ascii="Times New Roman" w:hAnsi="Times New Roman" w:eastAsia="Times New Roman" w:cs="Times New Roman"/>
+          <w:sz w:val="28"/>
+          <w:szCs w:val="28"/>
           <w:i/>
         </w:rPr>
         <w:t>]]</w:t>
@@ -562,33 +606,45 @@
       </w:pPr>
       <w:r>
         <w:rPr>
+          <w:rFonts w:ascii="Times New Roman" w:hAnsi="Times New Roman" w:eastAsia="Times New Roman" w:cs="Times New Roman"/>
+          <w:sz w:val="28"/>
+          <w:szCs w:val="28"/>
           <w:color w:val="000000"/>
         </w:rPr>
         <w:t xml:space="preserve">Kinh phí dự kiến: </w:t>
       </w:r>
       <w:r>
         <w:rPr>
-          <w:rFonts w:ascii="Times New Roman" w:hAnsi="Times New Roman"/>
+          <w:rFonts w:ascii="Times New Roman" w:hAnsi="Times New Roman" w:eastAsia="Times New Roman" w:cs="Times New Roman"/>
+          <w:sz w:val="28"/>
+          <w:szCs w:val="28"/>
           <w:i/>
         </w:rPr>
         <w:t>[[</w:t>
       </w:r>
       <w:r>
         <w:rPr>
-          <w:rFonts w:ascii="Times New Roman" w:hAnsi="Times New Roman"/>
+          <w:rFonts w:ascii="Times New Roman" w:hAnsi="Times New Roman" w:eastAsia="Times New Roman" w:cs="Times New Roman"/>
+          <w:sz w:val="28"/>
+          <w:szCs w:val="28"/>
           <w:i/>
         </w:rPr>
         <w:t>sotiendukien</w:t>
       </w:r>
       <w:r>
         <w:rPr>
-          <w:rFonts w:ascii="Times New Roman" w:hAnsi="Times New Roman"/>
+          <w:rFonts w:ascii="Times New Roman" w:hAnsi="Times New Roman" w:eastAsia="Times New Roman" w:cs="Times New Roman"/>
+          <w:sz w:val="28"/>
+          <w:szCs w:val="28"/>
           <w:i/>
         </w:rPr>
         <w:t>]]</w:t>
       </w:r>
       <w:r>
         <w:rPr>
+          <w:rFonts w:ascii="Times New Roman" w:hAnsi="Times New Roman" w:eastAsia="Times New Roman" w:cs="Times New Roman"/>
+          <w:sz w:val="28"/>
+          <w:szCs w:val="28"/>
           <w:color w:val="000000"/>
         </w:rPr>
         <w:t>đ</w:t>
@@ -602,6 +658,9 @@
       </w:pPr>
       <w:r>
         <w:rPr>
+          <w:rFonts w:ascii="Times New Roman" w:hAnsi="Times New Roman" w:eastAsia="Times New Roman" w:cs="Times New Roman"/>
+          <w:sz w:val="28"/>
+          <w:szCs w:val="28"/>
           <w:i/>
           <w:iCs/>
           <w:color w:val="000000"/>
@@ -610,6 +669,9 @@
       </w:r>
       <w:r>
         <w:rPr>
+          <w:rFonts w:ascii="Times New Roman" w:hAnsi="Times New Roman" w:eastAsia="Times New Roman" w:cs="Times New Roman"/>
+          <w:sz w:val="28"/>
+          <w:szCs w:val="28"/>
           <w:i/>
           <w:iCs/>
           <w:color w:val="000000"/>
@@ -618,6 +680,9 @@
       </w:r>
       <w:r>
         <w:rPr>
+          <w:rFonts w:ascii="Times New Roman" w:hAnsi="Times New Roman" w:eastAsia="Times New Roman" w:cs="Times New Roman"/>
+          <w:sz w:val="28"/>
+          <w:szCs w:val="28"/>
           <w:i/>
           <w:iCs/>
           <w:color w:val="000000"/>
@@ -626,34 +691,45 @@
       </w:r>
       <w:r>
         <w:rPr>
-          <w:rFonts w:ascii="Times New Roman" w:hAnsi="Times New Roman"/>
+          <w:rFonts w:ascii="Times New Roman" w:hAnsi="Times New Roman" w:eastAsia="Times New Roman" w:cs="Times New Roman"/>
+          <w:sz w:val="28"/>
+          <w:szCs w:val="28"/>
           <w:i/>
         </w:rPr>
         <w:t>[[</w:t>
       </w:r>
       <w:r>
         <w:rPr>
-          <w:rFonts w:ascii="Times New Roman" w:hAnsi="Times New Roman"/>
+          <w:rFonts w:ascii="Times New Roman" w:hAnsi="Times New Roman" w:eastAsia="Times New Roman" w:cs="Times New Roman"/>
+          <w:sz w:val="28"/>
+          <w:szCs w:val="28"/>
           <w:i/>
         </w:rPr>
         <w:t>sotiendukien</w:t>
       </w:r>
       <w:r>
         <w:rPr>
-          <w:rFonts w:ascii="Times New Roman" w:hAnsi="Times New Roman"/>
+          <w:rFonts w:ascii="Times New Roman" w:hAnsi="Times New Roman" w:eastAsia="Times New Roman" w:cs="Times New Roman"/>
+          <w:sz w:val="28"/>
+          <w:szCs w:val="28"/>
           <w:i/>
         </w:rPr>
         <w:t>bangchu</w:t>
       </w:r>
       <w:r>
         <w:rPr>
-          <w:rFonts w:ascii="Times New Roman" w:hAnsi="Times New Roman"/>
+          <w:rFonts w:ascii="Times New Roman" w:hAnsi="Times New Roman" w:eastAsia="Times New Roman" w:cs="Times New Roman"/>
+          <w:sz w:val="28"/>
+          <w:szCs w:val="28"/>
           <w:i/>
         </w:rPr>
         <w:t>]]</w:t>
       </w:r>
       <w:r>
         <w:rPr>
+          <w:rFonts w:ascii="Times New Roman" w:hAnsi="Times New Roman" w:eastAsia="Times New Roman" w:cs="Times New Roman"/>
+          <w:sz w:val="28"/>
+          <w:szCs w:val="28"/>
           <w:i/>
           <w:iCs/>
           <w:color w:val="000000"/>
@@ -662,6 +738,9 @@
       </w:r>
       <w:r>
         <w:rPr>
+          <w:rFonts w:ascii="Times New Roman" w:hAnsi="Times New Roman" w:eastAsia="Times New Roman" w:cs="Times New Roman"/>
+          <w:sz w:val="28"/>
+          <w:szCs w:val="28"/>
           <w:i/>
           <w:iCs/>
           <w:color w:val="000000"/>
@@ -677,18 +756,26 @@
       </w:pPr>
       <w:r>
         <w:rPr>
+          <w:rFonts w:ascii="Times New Roman" w:hAnsi="Times New Roman" w:eastAsia="Times New Roman" w:cs="Times New Roman"/>
+          <w:sz w:val="28"/>
+          <w:szCs w:val="28"/>
           <w:color w:val="000000"/>
         </w:rPr>
         <w:t xml:space="preserve">Kính đề nghị </w:t>
       </w:r>
       <w:r>
         <w:rPr>
-          <w:rFonts w:ascii="Times New Roman" w:hAnsi="Times New Roman"/>
+          <w:rFonts w:ascii="Times New Roman" w:hAnsi="Times New Roman" w:eastAsia="Times New Roman" w:cs="Times New Roman"/>
+          <w:sz w:val="28"/>
+          <w:szCs w:val="28"/>
         </w:rPr>
         <w:t>[[gioi_tinhtk]]</w:t>
       </w:r>
       <w:r>
         <w:rPr>
+          <w:rFonts w:ascii="Times New Roman" w:hAnsi="Times New Roman" w:eastAsia="Times New Roman" w:cs="Times New Roman"/>
+          <w:sz w:val="28"/>
+          <w:szCs w:val="28"/>
           <w:color w:val="000000"/>
         </w:rPr>
         <w:t xml:space="preserve"> xem xét, phê duyệt.</w:t>
@@ -1375,147 +1462,194 @@
       </w:pPr>
       <w:r>
         <w:rPr>
+          <w:rFonts w:ascii="Times New Roman" w:hAnsi="Times New Roman" w:eastAsia="Times New Roman" w:cs="Times New Roman"/>
+          <w:sz w:val="28"/>
+          <w:szCs w:val="28"/>
           <w:color w:val="000000"/>
         </w:rPr>
         <w:t>C</w:t>
       </w:r>
       <w:r>
         <w:rPr>
-          <w:rFonts w:hint="eastAsia"/>
+          <w:rFonts w:ascii="Times New Roman" w:hAnsi="Times New Roman" w:eastAsia="Times New Roman" w:cs="Times New Roman"/>
+          <w:sz w:val="28"/>
+          <w:szCs w:val="28"/>
           <w:color w:val="000000"/>
         </w:rPr>
         <w:t>ă</w:t>
       </w:r>
       <w:r>
         <w:rPr>
+          <w:rFonts w:ascii="Times New Roman" w:hAnsi="Times New Roman" w:eastAsia="Times New Roman" w:cs="Times New Roman"/>
+          <w:sz w:val="28"/>
+          <w:szCs w:val="28"/>
           <w:color w:val="000000"/>
         </w:rPr>
         <w:t xml:space="preserve">n cứ Giấy </w:t>
       </w:r>
       <w:r>
         <w:rPr>
-          <w:rFonts w:hint="eastAsia"/>
+          <w:rFonts w:ascii="Times New Roman" w:hAnsi="Times New Roman" w:eastAsia="Times New Roman" w:cs="Times New Roman"/>
+          <w:sz w:val="28"/>
+          <w:szCs w:val="28"/>
           <w:color w:val="000000"/>
         </w:rPr>
         <w:t>đ</w:t>
       </w:r>
       <w:r>
         <w:rPr>
+          <w:rFonts w:ascii="Times New Roman" w:hAnsi="Times New Roman" w:eastAsia="Times New Roman" w:cs="Times New Roman"/>
+          <w:sz w:val="28"/>
+          <w:szCs w:val="28"/>
           <w:color w:val="000000"/>
         </w:rPr>
         <w:t xml:space="preserve">ề nghị tiếp khách </w:t>
       </w:r>
       <w:r>
         <w:rPr>
-          <w:rFonts w:hint="eastAsia"/>
+          <w:rFonts w:ascii="Times New Roman" w:hAnsi="Times New Roman" w:eastAsia="Times New Roman" w:cs="Times New Roman"/>
+          <w:sz w:val="28"/>
+          <w:szCs w:val="28"/>
           <w:color w:val="000000"/>
         </w:rPr>
         <w:t>đã</w:t>
       </w:r>
       <w:r>
         <w:rPr>
+          <w:rFonts w:ascii="Times New Roman" w:hAnsi="Times New Roman" w:eastAsia="Times New Roman" w:cs="Times New Roman"/>
+          <w:sz w:val="28"/>
+          <w:szCs w:val="28"/>
           <w:color w:val="000000"/>
         </w:rPr>
         <w:t xml:space="preserve"> </w:t>
       </w:r>
       <w:r>
         <w:rPr>
-          <w:rFonts w:hint="eastAsia"/>
+          <w:rFonts w:ascii="Times New Roman" w:hAnsi="Times New Roman" w:eastAsia="Times New Roman" w:cs="Times New Roman"/>
+          <w:sz w:val="28"/>
+          <w:szCs w:val="28"/>
           <w:color w:val="000000"/>
         </w:rPr>
         <w:t>đư</w:t>
       </w:r>
       <w:r>
         <w:rPr>
+          <w:rFonts w:ascii="Times New Roman" w:hAnsi="Times New Roman" w:eastAsia="Times New Roman" w:cs="Times New Roman"/>
+          <w:sz w:val="28"/>
+          <w:szCs w:val="28"/>
           <w:color w:val="000000"/>
         </w:rPr>
         <w:t xml:space="preserve">ợc phê duyệt ngày </w:t>
       </w:r>
       <w:r>
         <w:rPr>
+          <w:rFonts w:ascii="Times New Roman" w:hAnsi="Times New Roman" w:eastAsia="Times New Roman" w:cs="Times New Roman"/>
+          <w:sz w:val="28"/>
+          <w:szCs w:val="28"/>
           <w:color w:val="000000"/>
         </w:rPr>
         <w:t>[[ngaytk]]/[[thangtk]]/ [[namtk]]</w:t>
       </w:r>
       <w:r>
         <w:rPr>
+          <w:rFonts w:ascii="Times New Roman" w:hAnsi="Times New Roman" w:eastAsia="Times New Roman" w:cs="Times New Roman"/>
+          <w:sz w:val="28"/>
+          <w:szCs w:val="28"/>
           <w:color w:val="000000"/>
         </w:rPr>
         <w:t xml:space="preserve"> của </w:t>
       </w:r>
       <w:r>
         <w:rPr>
-          <w:rFonts w:ascii="Times New Roman" w:hAnsi="Times New Roman"/>
-          <w:sz w:val="26"/>
-          <w:szCs w:val="26"/>
+          <w:rFonts w:ascii="Times New Roman" w:hAnsi="Times New Roman" w:eastAsia="Times New Roman" w:cs="Times New Roman"/>
+          <w:sz w:val="28"/>
+          <w:szCs w:val="28"/>
         </w:rPr>
         <w:t>[[</w:t>
       </w:r>
       <w:r>
         <w:rPr>
-          <w:rFonts w:ascii="Times New Roman" w:hAnsi="Times New Roman"/>
-          <w:sz w:val="26"/>
-          <w:szCs w:val="26"/>
+          <w:rFonts w:ascii="Times New Roman" w:hAnsi="Times New Roman" w:eastAsia="Times New Roman" w:cs="Times New Roman"/>
+          <w:sz w:val="28"/>
+          <w:szCs w:val="28"/>
         </w:rPr>
         <w:t>PHONGTK</w:t>
       </w:r>
       <w:r>
         <w:rPr>
-          <w:rFonts w:ascii="Times New Roman" w:hAnsi="Times New Roman"/>
-          <w:sz w:val="26"/>
-          <w:szCs w:val="26"/>
+          <w:rFonts w:ascii="Times New Roman" w:hAnsi="Times New Roman" w:eastAsia="Times New Roman" w:cs="Times New Roman"/>
+          <w:sz w:val="28"/>
+          <w:szCs w:val="28"/>
         </w:rPr>
         <w:t>VT</w:t>
       </w:r>
       <w:r>
         <w:rPr>
-          <w:rFonts w:ascii="Times New Roman" w:hAnsi="Times New Roman"/>
-          <w:sz w:val="26"/>
-          <w:szCs w:val="26"/>
+          <w:rFonts w:ascii="Times New Roman" w:hAnsi="Times New Roman" w:eastAsia="Times New Roman" w:cs="Times New Roman"/>
+          <w:sz w:val="28"/>
+          <w:szCs w:val="28"/>
         </w:rPr>
         <w:t>]]</w:t>
       </w:r>
       <w:r>
         <w:rPr>
+          <w:rFonts w:ascii="Times New Roman" w:hAnsi="Times New Roman" w:eastAsia="Times New Roman" w:cs="Times New Roman"/>
+          <w:sz w:val="28"/>
+          <w:szCs w:val="28"/>
           <w:color w:val="000000"/>
         </w:rPr>
         <w:t xml:space="preserve">, nay bộ phận </w:t>
       </w:r>
       <w:r>
         <w:rPr>
-          <w:rFonts w:hint="eastAsia"/>
+          <w:rFonts w:ascii="Times New Roman" w:hAnsi="Times New Roman" w:eastAsia="Times New Roman" w:cs="Times New Roman"/>
+          <w:sz w:val="28"/>
+          <w:szCs w:val="28"/>
           <w:color w:val="000000"/>
         </w:rPr>
         <w:t>đư</w:t>
       </w:r>
       <w:r>
         <w:rPr>
+          <w:rFonts w:ascii="Times New Roman" w:hAnsi="Times New Roman" w:eastAsia="Times New Roman" w:cs="Times New Roman"/>
+          <w:sz w:val="28"/>
+          <w:szCs w:val="28"/>
           <w:color w:val="000000"/>
         </w:rPr>
         <w:t xml:space="preserve">ợc giao tiếp khách </w:t>
       </w:r>
       <w:r>
         <w:rPr>
-          <w:rFonts w:hint="eastAsia"/>
+          <w:rFonts w:ascii="Times New Roman" w:hAnsi="Times New Roman" w:eastAsia="Times New Roman" w:cs="Times New Roman"/>
+          <w:sz w:val="28"/>
+          <w:szCs w:val="28"/>
           <w:color w:val="000000"/>
         </w:rPr>
         <w:t>đ</w:t>
       </w:r>
       <w:r>
         <w:rPr>
+          <w:rFonts w:ascii="Times New Roman" w:hAnsi="Times New Roman" w:eastAsia="Times New Roman" w:cs="Times New Roman"/>
+          <w:sz w:val="28"/>
+          <w:szCs w:val="28"/>
           <w:color w:val="000000"/>
         </w:rPr>
         <w:t>ề nghị thanh toán chi phí tiếp khách với nội dung nh</w:t>
       </w:r>
       <w:r>
         <w:rPr>
-          <w:rFonts w:hint="eastAsia"/>
+          <w:rFonts w:ascii="Times New Roman" w:hAnsi="Times New Roman" w:eastAsia="Times New Roman" w:cs="Times New Roman"/>
+          <w:sz w:val="28"/>
+          <w:szCs w:val="28"/>
           <w:color w:val="000000"/>
         </w:rPr>
         <w:t>ư</w:t>
       </w:r>
       <w:r>
         <w:rPr>
+          <w:rFonts w:ascii="Times New Roman" w:hAnsi="Times New Roman" w:eastAsia="Times New Roman" w:cs="Times New Roman"/>
+          <w:sz w:val="28"/>
+          <w:szCs w:val="28"/>
           <w:color w:val="000000"/>
         </w:rPr>
         <w:t xml:space="preserve"> sau:</w:t>
@@ -1532,31 +1666,45 @@
       </w:pPr>
       <w:r>
         <w:rPr>
+          <w:rFonts w:ascii="Times New Roman" w:hAnsi="Times New Roman" w:eastAsia="Times New Roman" w:cs="Times New Roman"/>
+          <w:sz w:val="28"/>
+          <w:szCs w:val="28"/>
           <w:color w:val="000000"/>
         </w:rPr>
         <w:t>1.</w:t>
       </w:r>
       <w:r>
         <w:rPr>
+          <w:rFonts w:ascii="Times New Roman" w:hAnsi="Times New Roman" w:eastAsia="Times New Roman" w:cs="Times New Roman"/>
+          <w:sz w:val="28"/>
+          <w:szCs w:val="28"/>
           <w:color w:val="000000"/>
         </w:rPr>
         <w:t xml:space="preserve"> </w:t>
       </w:r>
       <w:r>
         <w:rPr>
+          <w:rFonts w:ascii="Times New Roman" w:hAnsi="Times New Roman" w:eastAsia="Times New Roman" w:cs="Times New Roman"/>
+          <w:sz w:val="28"/>
+          <w:szCs w:val="28"/>
           <w:color w:val="000000"/>
         </w:rPr>
         <w:t>Nội dung thanh toán: Tiếp khách c</w:t>
       </w:r>
       <w:r>
         <w:rPr>
-          <w:rFonts w:hint="eastAsia"/>
+          <w:rFonts w:ascii="Times New Roman" w:hAnsi="Times New Roman" w:eastAsia="Times New Roman" w:cs="Times New Roman"/>
+          <w:sz w:val="28"/>
+          <w:szCs w:val="28"/>
           <w:color w:val="000000"/>
         </w:rPr>
         <w:t>ơ</w:t>
       </w:r>
       <w:r>
         <w:rPr>
+          <w:rFonts w:ascii="Times New Roman" w:hAnsi="Times New Roman" w:eastAsia="Times New Roman" w:cs="Times New Roman"/>
+          <w:sz w:val="28"/>
+          <w:szCs w:val="28"/>
           <w:color w:val="000000"/>
         </w:rPr>
         <w:t xml:space="preserve"> quan</w:t>
@@ -1573,55 +1721,81 @@
       </w:pPr>
       <w:r>
         <w:rPr>
+          <w:rFonts w:ascii="Times New Roman" w:hAnsi="Times New Roman" w:eastAsia="Times New Roman" w:cs="Times New Roman"/>
+          <w:sz w:val="28"/>
+          <w:szCs w:val="28"/>
           <w:color w:val="000000"/>
         </w:rPr>
         <w:t>2.</w:t>
       </w:r>
       <w:r>
         <w:rPr>
+          <w:rFonts w:ascii="Times New Roman" w:hAnsi="Times New Roman" w:eastAsia="Times New Roman" w:cs="Times New Roman"/>
+          <w:sz w:val="28"/>
+          <w:szCs w:val="28"/>
           <w:color w:val="000000"/>
         </w:rPr>
         <w:t xml:space="preserve"> </w:t>
       </w:r>
       <w:r>
         <w:rPr>
+          <w:rFonts w:ascii="Times New Roman" w:hAnsi="Times New Roman" w:eastAsia="Times New Roman" w:cs="Times New Roman"/>
+          <w:sz w:val="28"/>
+          <w:szCs w:val="28"/>
           <w:color w:val="000000"/>
         </w:rPr>
         <w:t xml:space="preserve">Số tiền </w:t>
       </w:r>
       <w:r>
         <w:rPr>
-          <w:rFonts w:hint="eastAsia"/>
+          <w:rFonts w:ascii="Times New Roman" w:hAnsi="Times New Roman" w:eastAsia="Times New Roman" w:cs="Times New Roman"/>
+          <w:sz w:val="28"/>
+          <w:szCs w:val="28"/>
           <w:color w:val="000000"/>
         </w:rPr>
         <w:t>đ</w:t>
       </w:r>
       <w:r>
         <w:rPr>
+          <w:rFonts w:ascii="Times New Roman" w:hAnsi="Times New Roman" w:eastAsia="Times New Roman" w:cs="Times New Roman"/>
+          <w:sz w:val="28"/>
+          <w:szCs w:val="28"/>
           <w:color w:val="000000"/>
         </w:rPr>
         <w:t xml:space="preserve">ề nghị thanh toán: </w:t>
       </w:r>
       <w:r>
         <w:rPr>
+          <w:rFonts w:ascii="Times New Roman" w:hAnsi="Times New Roman" w:eastAsia="Times New Roman" w:cs="Times New Roman"/>
+          <w:sz w:val="28"/>
+          <w:szCs w:val="28"/>
           <w:color w:val="000000"/>
         </w:rPr>
         <w:t>[[sotien</w:t>
       </w:r>
       <w:r>
         <w:rPr>
+          <w:rFonts w:ascii="Times New Roman" w:hAnsi="Times New Roman" w:eastAsia="Times New Roman" w:cs="Times New Roman"/>
+          <w:sz w:val="28"/>
+          <w:szCs w:val="28"/>
           <w:color w:val="000000"/>
         </w:rPr>
         <w:t>tt</w:t>
       </w:r>
       <w:r>
         <w:rPr>
+          <w:rFonts w:ascii="Times New Roman" w:hAnsi="Times New Roman" w:eastAsia="Times New Roman" w:cs="Times New Roman"/>
+          <w:sz w:val="28"/>
+          <w:szCs w:val="28"/>
           <w:color w:val="000000"/>
         </w:rPr>
         <w:t>]]</w:t>
       </w:r>
       <w:r>
         <w:rPr>
+          <w:rFonts w:ascii="Times New Roman" w:hAnsi="Times New Roman" w:eastAsia="Times New Roman" w:cs="Times New Roman"/>
+          <w:sz w:val="28"/>
+          <w:szCs w:val="28"/>
           <w:color w:val="000000"/>
         </w:rPr>
         <w:t xml:space="preserve"> đồng</w:t>
@@ -1641,6 +1815,9 @@
       </w:pPr>
       <w:r>
         <w:rPr>
+          <w:rFonts w:ascii="Times New Roman" w:hAnsi="Times New Roman" w:eastAsia="Times New Roman" w:cs="Times New Roman"/>
+          <w:sz w:val="28"/>
+          <w:szCs w:val="28"/>
           <w:i/>
           <w:iCs/>
           <w:color w:val="000000"/>
@@ -1650,6 +1827,9 @@
       </w:r>
       <w:r>
         <w:rPr>
+          <w:rFonts w:ascii="Times New Roman" w:hAnsi="Times New Roman" w:eastAsia="Times New Roman" w:cs="Times New Roman"/>
+          <w:sz w:val="28"/>
+          <w:szCs w:val="28"/>
           <w:i/>
           <w:iCs/>
           <w:color w:val="000000"/>
@@ -1659,6 +1839,9 @@
       </w:r>
       <w:r>
         <w:rPr>
+          <w:rFonts w:ascii="Times New Roman" w:hAnsi="Times New Roman" w:eastAsia="Times New Roman" w:cs="Times New Roman"/>
+          <w:sz w:val="28"/>
+          <w:szCs w:val="28"/>
           <w:i/>
           <w:iCs/>
           <w:color w:val="000000"/>
@@ -1668,6 +1851,9 @@
       </w:r>
       <w:r>
         <w:rPr>
+          <w:rFonts w:ascii="Times New Roman" w:hAnsi="Times New Roman" w:eastAsia="Times New Roman" w:cs="Times New Roman"/>
+          <w:sz w:val="28"/>
+          <w:szCs w:val="28"/>
           <w:i/>
           <w:iCs/>
           <w:color w:val="000000"/>
@@ -1677,6 +1863,9 @@
       </w:r>
       <w:r>
         <w:rPr>
+          <w:rFonts w:ascii="Times New Roman" w:hAnsi="Times New Roman" w:eastAsia="Times New Roman" w:cs="Times New Roman"/>
+          <w:sz w:val="28"/>
+          <w:szCs w:val="28"/>
           <w:i/>
           <w:iCs/>
           <w:color w:val="000000"/>
@@ -1686,6 +1875,9 @@
       </w:r>
       <w:r>
         <w:rPr>
+          <w:rFonts w:ascii="Times New Roman" w:hAnsi="Times New Roman" w:eastAsia="Times New Roman" w:cs="Times New Roman"/>
+          <w:sz w:val="28"/>
+          <w:szCs w:val="28"/>
           <w:i/>
           <w:iCs/>
           <w:color w:val="000000"/>
@@ -1705,30 +1897,45 @@
       </w:pPr>
       <w:r>
         <w:rPr>
+          <w:rFonts w:ascii="Times New Roman" w:hAnsi="Times New Roman" w:eastAsia="Times New Roman" w:cs="Times New Roman"/>
+          <w:sz w:val="28"/>
+          <w:szCs w:val="28"/>
           <w:color w:val="000000"/>
         </w:rPr>
         <w:t>3.</w:t>
       </w:r>
       <w:r>
         <w:rPr>
+          <w:rFonts w:ascii="Times New Roman" w:hAnsi="Times New Roman" w:eastAsia="Times New Roman" w:cs="Times New Roman"/>
+          <w:sz w:val="28"/>
+          <w:szCs w:val="28"/>
           <w:color w:val="000000"/>
         </w:rPr>
         <w:t xml:space="preserve"> </w:t>
       </w:r>
       <w:r>
         <w:rPr>
+          <w:rFonts w:ascii="Times New Roman" w:hAnsi="Times New Roman" w:eastAsia="Times New Roman" w:cs="Times New Roman"/>
+          <w:sz w:val="28"/>
+          <w:szCs w:val="28"/>
           <w:color w:val="000000"/>
         </w:rPr>
         <w:t xml:space="preserve">Hình thức thanh toán: </w:t>
       </w:r>
       <w:r>
         <w:rPr>
+          <w:rFonts w:ascii="Times New Roman" w:hAnsi="Times New Roman" w:eastAsia="Times New Roman" w:cs="Times New Roman"/>
+          <w:sz w:val="28"/>
+          <w:szCs w:val="28"/>
           <w:color w:val="000000"/>
         </w:rPr>
         <w:t>Hoàn tạm ứng</w:t>
       </w:r>
       <w:r>
         <w:rPr>
+          <w:rFonts w:ascii="Times New Roman" w:hAnsi="Times New Roman" w:eastAsia="Times New Roman" w:cs="Times New Roman"/>
+          <w:sz w:val="28"/>
+          <w:szCs w:val="28"/>
           <w:color w:val="000000"/>
         </w:rPr>
         <w:t>.</w:t>
@@ -1745,44 +1952,63 @@
       </w:pPr>
       <w:r>
         <w:rPr>
+          <w:rFonts w:ascii="Times New Roman" w:hAnsi="Times New Roman" w:eastAsia="Times New Roman" w:cs="Times New Roman"/>
+          <w:sz w:val="28"/>
+          <w:szCs w:val="28"/>
           <w:color w:val="000000"/>
         </w:rPr>
         <w:t>4.</w:t>
       </w:r>
       <w:r>
         <w:rPr>
+          <w:rFonts w:ascii="Times New Roman" w:hAnsi="Times New Roman" w:eastAsia="Times New Roman" w:cs="Times New Roman"/>
+          <w:sz w:val="28"/>
+          <w:szCs w:val="28"/>
           <w:color w:val="000000"/>
         </w:rPr>
         <w:t xml:space="preserve"> </w:t>
       </w:r>
       <w:r>
         <w:rPr>
+          <w:rFonts w:ascii="Times New Roman" w:hAnsi="Times New Roman" w:eastAsia="Times New Roman" w:cs="Times New Roman"/>
+          <w:sz w:val="28"/>
+          <w:szCs w:val="28"/>
           <w:color w:val="000000"/>
         </w:rPr>
         <w:t>Hồ s</w:t>
       </w:r>
       <w:r>
         <w:rPr>
-          <w:rFonts w:hint="eastAsia"/>
+          <w:rFonts w:ascii="Times New Roman" w:hAnsi="Times New Roman" w:eastAsia="Times New Roman" w:cs="Times New Roman"/>
+          <w:sz w:val="28"/>
+          <w:szCs w:val="28"/>
           <w:color w:val="000000"/>
         </w:rPr>
         <w:t>ơ</w:t>
       </w:r>
       <w:r>
         <w:rPr>
+          <w:rFonts w:ascii="Times New Roman" w:hAnsi="Times New Roman" w:eastAsia="Times New Roman" w:cs="Times New Roman"/>
+          <w:sz w:val="28"/>
+          <w:szCs w:val="28"/>
           <w:color w:val="000000"/>
         </w:rPr>
         <w:t xml:space="preserve"> thanh toán </w:t>
       </w:r>
       <w:r>
         <w:rPr>
-          <w:rFonts w:hint="eastAsia"/>
+          <w:rFonts w:ascii="Times New Roman" w:hAnsi="Times New Roman" w:eastAsia="Times New Roman" w:cs="Times New Roman"/>
+          <w:sz w:val="28"/>
+          <w:szCs w:val="28"/>
           <w:color w:val="000000"/>
         </w:rPr>
         <w:t>đí</w:t>
       </w:r>
       <w:r>
         <w:rPr>
+          <w:rFonts w:ascii="Times New Roman" w:hAnsi="Times New Roman" w:eastAsia="Times New Roman" w:cs="Times New Roman"/>
+          <w:sz w:val="28"/>
+          <w:szCs w:val="28"/>
           <w:color w:val="000000"/>
         </w:rPr>
         <w:t>nh kèm gồm:</w:t>
@@ -1799,31 +2025,45 @@
       </w:pPr>
       <w:r>
         <w:rPr>
+          <w:rFonts w:ascii="Times New Roman" w:hAnsi="Times New Roman" w:eastAsia="Times New Roman" w:cs="Times New Roman"/>
+          <w:sz w:val="28"/>
+          <w:szCs w:val="28"/>
           <w:color w:val="000000"/>
         </w:rPr>
         <w:t>-</w:t>
       </w:r>
       <w:r>
         <w:rPr>
+          <w:rFonts w:ascii="Times New Roman" w:hAnsi="Times New Roman" w:eastAsia="Times New Roman" w:cs="Times New Roman"/>
+          <w:sz w:val="28"/>
+          <w:szCs w:val="28"/>
           <w:color w:val="000000"/>
         </w:rPr>
         <w:t xml:space="preserve"> </w:t>
       </w:r>
       <w:r>
         <w:rPr>
+          <w:rFonts w:ascii="Times New Roman" w:hAnsi="Times New Roman" w:eastAsia="Times New Roman" w:cs="Times New Roman"/>
+          <w:sz w:val="28"/>
+          <w:szCs w:val="28"/>
           <w:color w:val="000000"/>
         </w:rPr>
         <w:t xml:space="preserve">Giấy </w:t>
       </w:r>
       <w:r>
         <w:rPr>
-          <w:rFonts w:hint="eastAsia"/>
+          <w:rFonts w:ascii="Times New Roman" w:hAnsi="Times New Roman" w:eastAsia="Times New Roman" w:cs="Times New Roman"/>
+          <w:sz w:val="28"/>
+          <w:szCs w:val="28"/>
           <w:color w:val="000000"/>
         </w:rPr>
         <w:t>đ</w:t>
       </w:r>
       <w:r>
         <w:rPr>
+          <w:rFonts w:ascii="Times New Roman" w:hAnsi="Times New Roman" w:eastAsia="Times New Roman" w:cs="Times New Roman"/>
+          <w:sz w:val="28"/>
+          <w:szCs w:val="28"/>
           <w:color w:val="000000"/>
         </w:rPr>
         <w:t>ề nghị tiếp khách;</w:t>
@@ -1840,97 +2080,135 @@
       </w:pPr>
       <w:r>
         <w:rPr>
+          <w:rFonts w:ascii="Times New Roman" w:hAnsi="Times New Roman" w:eastAsia="Times New Roman" w:cs="Times New Roman"/>
+          <w:sz w:val="28"/>
+          <w:szCs w:val="28"/>
           <w:color w:val="000000"/>
         </w:rPr>
         <w:t>-</w:t>
       </w:r>
       <w:r>
         <w:rPr>
+          <w:rFonts w:ascii="Times New Roman" w:hAnsi="Times New Roman" w:eastAsia="Times New Roman" w:cs="Times New Roman"/>
+          <w:sz w:val="28"/>
+          <w:szCs w:val="28"/>
           <w:color w:val="000000"/>
         </w:rPr>
         <w:t xml:space="preserve"> </w:t>
       </w:r>
       <w:r>
         <w:rPr>
+          <w:rFonts w:ascii="Times New Roman" w:hAnsi="Times New Roman" w:eastAsia="Times New Roman" w:cs="Times New Roman"/>
+          <w:sz w:val="28"/>
+          <w:szCs w:val="28"/>
           <w:color w:val="000000"/>
         </w:rPr>
         <w:t xml:space="preserve">Hóa </w:t>
       </w:r>
       <w:r>
         <w:rPr>
-          <w:rFonts w:hint="eastAsia"/>
+          <w:rFonts w:ascii="Times New Roman" w:hAnsi="Times New Roman" w:eastAsia="Times New Roman" w:cs="Times New Roman"/>
+          <w:sz w:val="28"/>
+          <w:szCs w:val="28"/>
           <w:color w:val="000000"/>
         </w:rPr>
         <w:t>đơ</w:t>
       </w:r>
       <w:r>
         <w:rPr>
+          <w:rFonts w:ascii="Times New Roman" w:hAnsi="Times New Roman" w:eastAsia="Times New Roman" w:cs="Times New Roman"/>
+          <w:sz w:val="28"/>
+          <w:szCs w:val="28"/>
           <w:color w:val="000000"/>
         </w:rPr>
         <w:t xml:space="preserve">n mã </w:t>
       </w:r>
       <w:r>
         <w:rPr>
-          <w:rFonts w:ascii="Times New Roman" w:hAnsi="Times New Roman"/>
+          <w:rFonts w:ascii="Times New Roman" w:hAnsi="Times New Roman" w:eastAsia="Times New Roman" w:cs="Times New Roman"/>
+          <w:sz w:val="28"/>
+          <w:szCs w:val="28"/>
           <w:iCs/>
         </w:rPr>
         <w:t>[[</w:t>
       </w:r>
       <w:r>
         <w:rPr>
-          <w:rFonts w:ascii="Times New Roman" w:hAnsi="Times New Roman"/>
+          <w:rFonts w:ascii="Times New Roman" w:hAnsi="Times New Roman" w:eastAsia="Times New Roman" w:cs="Times New Roman"/>
+          <w:sz w:val="28"/>
+          <w:szCs w:val="28"/>
           <w:iCs/>
         </w:rPr>
         <w:t>mahoadon</w:t>
       </w:r>
       <w:r>
         <w:rPr>
-          <w:rFonts w:ascii="Times New Roman" w:hAnsi="Times New Roman"/>
+          <w:rFonts w:ascii="Times New Roman" w:hAnsi="Times New Roman" w:eastAsia="Times New Roman" w:cs="Times New Roman"/>
+          <w:sz w:val="28"/>
+          <w:szCs w:val="28"/>
           <w:iCs/>
         </w:rPr>
         <w:t>]]</w:t>
       </w:r>
       <w:r>
         <w:rPr>
+          <w:rFonts w:ascii="Times New Roman" w:hAnsi="Times New Roman" w:eastAsia="Times New Roman" w:cs="Times New Roman"/>
+          <w:sz w:val="28"/>
+          <w:szCs w:val="28"/>
           <w:color w:val="000000"/>
         </w:rPr>
         <w:t xml:space="preserve">, số </w:t>
       </w:r>
       <w:r>
         <w:rPr>
-          <w:rFonts w:ascii="Times New Roman" w:hAnsi="Times New Roman"/>
+          <w:rFonts w:ascii="Times New Roman" w:hAnsi="Times New Roman" w:eastAsia="Times New Roman" w:cs="Times New Roman"/>
+          <w:sz w:val="28"/>
+          <w:szCs w:val="28"/>
           <w:iCs/>
         </w:rPr>
         <w:t>[[</w:t>
       </w:r>
       <w:r>
         <w:rPr>
-          <w:rFonts w:ascii="Times New Roman" w:hAnsi="Times New Roman"/>
+          <w:rFonts w:ascii="Times New Roman" w:hAnsi="Times New Roman" w:eastAsia="Times New Roman" w:cs="Times New Roman"/>
+          <w:sz w:val="28"/>
+          <w:szCs w:val="28"/>
           <w:iCs/>
         </w:rPr>
         <w:t>so</w:t>
       </w:r>
       <w:r>
         <w:rPr>
-          <w:rFonts w:ascii="Times New Roman" w:hAnsi="Times New Roman"/>
+          <w:rFonts w:ascii="Times New Roman" w:hAnsi="Times New Roman" w:eastAsia="Times New Roman" w:cs="Times New Roman"/>
+          <w:sz w:val="28"/>
+          <w:szCs w:val="28"/>
           <w:iCs/>
         </w:rPr>
         <w:t>hoadon]]</w:t>
       </w:r>
       <w:r>
         <w:rPr>
+          <w:rFonts w:ascii="Times New Roman" w:hAnsi="Times New Roman" w:eastAsia="Times New Roman" w:cs="Times New Roman"/>
+          <w:sz w:val="28"/>
+          <w:szCs w:val="28"/>
           <w:color w:val="000000"/>
         </w:rPr>
         <w:t xml:space="preserve">, ngày </w:t>
       </w:r>
       <w:r>
         <w:rPr>
+          <w:rFonts w:ascii="Times New Roman" w:hAnsi="Times New Roman" w:eastAsia="Times New Roman" w:cs="Times New Roman"/>
+          <w:sz w:val="28"/>
+          <w:szCs w:val="28"/>
           <w:color w:val="000000"/>
         </w:rPr>
         <w:t>[[ngaytk]]/[[thangtk]]/ [[namtk]]</w:t>
       </w:r>
       <w:r>
         <w:rPr>
+          <w:rFonts w:ascii="Times New Roman" w:hAnsi="Times New Roman" w:eastAsia="Times New Roman" w:cs="Times New Roman"/>
+          <w:sz w:val="28"/>
+          <w:szCs w:val="28"/>
           <w:color w:val="000000"/>
         </w:rPr>
         <w:t>;</w:t>
@@ -1944,44 +2222,63 @@
       </w:pPr>
       <w:r>
         <w:rPr>
+          <w:rFonts w:ascii="Times New Roman" w:hAnsi="Times New Roman" w:eastAsia="Times New Roman" w:cs="Times New Roman"/>
+          <w:sz w:val="28"/>
+          <w:szCs w:val="28"/>
           <w:color w:val="000000"/>
         </w:rPr>
         <w:t xml:space="preserve">Kính </w:t>
       </w:r>
       <w:r>
         <w:rPr>
-          <w:rFonts w:hint="eastAsia"/>
+          <w:rFonts w:ascii="Times New Roman" w:hAnsi="Times New Roman" w:eastAsia="Times New Roman" w:cs="Times New Roman"/>
+          <w:sz w:val="28"/>
+          <w:szCs w:val="28"/>
           <w:color w:val="000000"/>
         </w:rPr>
         <w:t>đ</w:t>
       </w:r>
       <w:r>
         <w:rPr>
+          <w:rFonts w:ascii="Times New Roman" w:hAnsi="Times New Roman" w:eastAsia="Times New Roman" w:cs="Times New Roman"/>
+          <w:sz w:val="28"/>
+          <w:szCs w:val="28"/>
           <w:color w:val="000000"/>
         </w:rPr>
         <w:t xml:space="preserve">ề nghị </w:t>
       </w:r>
       <w:r>
         <w:rPr>
+          <w:rFonts w:ascii="Times New Roman" w:hAnsi="Times New Roman" w:eastAsia="Times New Roman" w:cs="Times New Roman"/>
+          <w:sz w:val="28"/>
+          <w:szCs w:val="28"/>
           <w:color w:val="000000"/>
         </w:rPr>
         <w:t>[[gioi_tinhtt]]</w:t>
       </w:r>
       <w:r>
         <w:rPr>
+          <w:rFonts w:ascii="Times New Roman" w:hAnsi="Times New Roman" w:eastAsia="Times New Roman" w:cs="Times New Roman"/>
+          <w:sz w:val="28"/>
+          <w:szCs w:val="28"/>
           <w:color w:val="000000"/>
         </w:rPr>
         <w:t xml:space="preserve"> xem xét, phê duyệt thanh toán theo quy </w:t>
       </w:r>
       <w:r>
         <w:rPr>
-          <w:rFonts w:hint="eastAsia"/>
+          <w:rFonts w:ascii="Times New Roman" w:hAnsi="Times New Roman" w:eastAsia="Times New Roman" w:cs="Times New Roman"/>
+          <w:sz w:val="28"/>
+          <w:szCs w:val="28"/>
           <w:color w:val="000000"/>
         </w:rPr>
         <w:t>đ</w:t>
       </w:r>
       <w:r>
         <w:rPr>
+          <w:rFonts w:ascii="Times New Roman" w:hAnsi="Times New Roman" w:eastAsia="Times New Roman" w:cs="Times New Roman"/>
+          <w:sz w:val="28"/>
+          <w:szCs w:val="28"/>
           <w:color w:val="000000"/>
         </w:rPr>
         <w:t>ịnh.</w:t>

</xml_diff>

<commit_message>
feat: add actual-spending filter and Drive backups
</commit_message>
<xml_diff>
--- a/Mau/tiep khach va thanh toan.docx
+++ b/Mau/tiep khach va thanh toan.docx
@@ -220,14 +220,14 @@
                 <w:rFonts w:ascii="Times New Roman" w:hAnsi="Times New Roman"/>
                 <w:i/>
               </w:rPr>
-              <w:t>[[ngay</w:t>
+              <w:t>[[ngaydntk</w:t>
             </w:r>
             <w:r>
               <w:rPr>
                 <w:rFonts w:ascii="Times New Roman" w:hAnsi="Times New Roman"/>
                 <w:i/>
               </w:rPr>
-              <w:t>tk</w:t>
+              <w:t/>
             </w:r>
             <w:r>
               <w:rPr>
@@ -269,14 +269,14 @@
                 <w:rFonts w:ascii="Times New Roman" w:hAnsi="Times New Roman"/>
                 <w:i/>
               </w:rPr>
-              <w:t>[[thang</w:t>
+              <w:t>[[thangdntk</w:t>
             </w:r>
             <w:r>
               <w:rPr>
                 <w:rFonts w:ascii="Times New Roman" w:hAnsi="Times New Roman"/>
                 <w:i/>
               </w:rPr>
-              <w:t>tk</w:t>
+              <w:t/>
             </w:r>
             <w:r>
               <w:rPr>
@@ -304,14 +304,14 @@
                 <w:rFonts w:ascii="Times New Roman" w:hAnsi="Times New Roman"/>
                 <w:i/>
               </w:rPr>
-              <w:t>[[nam</w:t>
+              <w:t>[[namdntk</w:t>
             </w:r>
             <w:r>
               <w:rPr>
                 <w:rFonts w:ascii="Times New Roman" w:hAnsi="Times New Roman"/>
                 <w:i/>
               </w:rPr>
-              <w:t>tk</w:t>
+              <w:t/>
             </w:r>
             <w:r>
               <w:rPr>
@@ -1548,7 +1548,7 @@
           <w:szCs w:val="28"/>
           <w:color w:val="000000"/>
         </w:rPr>
-        <w:t>[[ngaytk]]/[[thangtk]]/ [[namtk]]</w:t>
+        <w:t>[[ngaydntk]]/[[thangdntk]]/ [[namdntk]]</w:t>
       </w:r>
       <w:r>
         <w:rPr>

</xml_diff>

<commit_message>
sync: capture deployed VPS source and payment appendix flow
</commit_message>
<xml_diff>
--- a/Mau/tiep khach va thanh toan.docx
+++ b/Mau/tiep khach va thanh toan.docx
@@ -146,8 +146,8 @@
               </w:rPr>
               <w:t xml:space="preserve">CỘNG HÒA XÃ HỘI CHỦ NGHĨA VIỆT </w:t>
             </w:r>
-            <w:smartTag w:uri="urn:schemas-microsoft-com:office:smarttags" w:element="country-region">
-              <w:smartTag w:uri="urn:schemas-microsoft-com:office:smarttags" w:element="place">
+            <w:smartTag w:uri="urn:schemas-microsoft-com:office:smarttags" w:element="place">
+              <w:smartTag w:uri="urn:schemas-microsoft-com:office:smarttags" w:element="country-region">
                 <w:r>
                   <w:rPr>
                     <w:rFonts w:ascii="Times New Roman Bold" w:hAnsi="Times New Roman Bold"/>
@@ -220,27 +220,34 @@
                 <w:rFonts w:ascii="Times New Roman" w:hAnsi="Times New Roman"/>
                 <w:i/>
               </w:rPr>
-              <w:t>[[ngaydntk</w:t>
+              <w:t>[[ngaydntk]]</w:t>
             </w:r>
             <w:r>
               <w:rPr>
                 <w:rFonts w:ascii="Times New Roman" w:hAnsi="Times New Roman"/>
                 <w:i/>
               </w:rPr>
-              <w:t/>
+              <w:t xml:space="preserve"> </w:t>
             </w:r>
             <w:r>
               <w:rPr>
                 <w:rFonts w:ascii="Times New Roman" w:hAnsi="Times New Roman"/>
                 <w:i/>
               </w:rPr>
-              <w:t>]]</w:t>
+              <w:t>t</w:t>
             </w:r>
             <w:r>
               <w:rPr>
                 <w:rFonts w:ascii="Times New Roman" w:hAnsi="Times New Roman"/>
                 <w:i/>
               </w:rPr>
+              <w:t>háng</w:t>
+            </w:r>
+            <w:r>
+              <w:rPr>
+                <w:rFonts w:ascii="Times New Roman" w:hAnsi="Times New Roman"/>
+                <w:i/>
+              </w:rPr>
               <w:t xml:space="preserve"> </w:t>
             </w:r>
             <w:r>
@@ -248,77 +255,28 @@
                 <w:rFonts w:ascii="Times New Roman" w:hAnsi="Times New Roman"/>
                 <w:i/>
               </w:rPr>
-              <w:t>t</w:t>
+              <w:t>[[thangdntk]]</w:t>
             </w:r>
             <w:r>
               <w:rPr>
                 <w:rFonts w:ascii="Times New Roman" w:hAnsi="Times New Roman"/>
                 <w:i/>
               </w:rPr>
-              <w:t>háng</w:t>
+              <w:t xml:space="preserve"> </w:t>
             </w:r>
             <w:r>
               <w:rPr>
                 <w:rFonts w:ascii="Times New Roman" w:hAnsi="Times New Roman"/>
                 <w:i/>
               </w:rPr>
-              <w:t xml:space="preserve"> </w:t>
+              <w:t xml:space="preserve">năm </w:t>
             </w:r>
             <w:r>
               <w:rPr>
                 <w:rFonts w:ascii="Times New Roman" w:hAnsi="Times New Roman"/>
                 <w:i/>
               </w:rPr>
-              <w:t>[[thangdntk</w:t>
-            </w:r>
-            <w:r>
-              <w:rPr>
-                <w:rFonts w:ascii="Times New Roman" w:hAnsi="Times New Roman"/>
-                <w:i/>
-              </w:rPr>
-              <w:t/>
-            </w:r>
-            <w:r>
-              <w:rPr>
-                <w:rFonts w:ascii="Times New Roman" w:hAnsi="Times New Roman"/>
-                <w:i/>
-              </w:rPr>
-              <w:t>]]</w:t>
-            </w:r>
-            <w:r>
-              <w:rPr>
-                <w:rFonts w:ascii="Times New Roman" w:hAnsi="Times New Roman"/>
-                <w:i/>
-              </w:rPr>
-              <w:t xml:space="preserve"> </w:t>
-            </w:r>
-            <w:r>
-              <w:rPr>
-                <w:rFonts w:ascii="Times New Roman" w:hAnsi="Times New Roman"/>
-                <w:i/>
-              </w:rPr>
-              <w:t xml:space="preserve">năm </w:t>
-            </w:r>
-            <w:r>
-              <w:rPr>
-                <w:rFonts w:ascii="Times New Roman" w:hAnsi="Times New Roman"/>
-                <w:i/>
-              </w:rPr>
-              <w:t>[[namdntk</w:t>
-            </w:r>
-            <w:r>
-              <w:rPr>
-                <w:rFonts w:ascii="Times New Roman" w:hAnsi="Times New Roman"/>
-                <w:i/>
-              </w:rPr>
-              <w:t/>
-            </w:r>
-            <w:r>
-              <w:rPr>
-                <w:rFonts w:ascii="Times New Roman" w:hAnsi="Times New Roman"/>
-                <w:i/>
-              </w:rPr>
-              <w:t>]]</w:t>
+              <w:t>[[namdntk]]</w:t>
             </w:r>
           </w:p>
         </w:tc>
@@ -416,9 +374,7 @@
       </w:pPr>
       <w:r>
         <w:rPr>
-          <w:rFonts w:ascii="Times New Roman" w:hAnsi="Times New Roman" w:eastAsia="Times New Roman" w:cs="Times New Roman"/>
-          <w:sz w:val="28"/>
-          <w:szCs w:val="28"/>
+          <w:rFonts w:ascii="Times New Roman" w:hAnsi="Times New Roman"/>
           <w:color w:val="000000"/>
         </w:rPr>
         <w:t>Căn cứ văn bản 3358/NHCS-KTTC ngày 01/9/2016 của Tổng Giám đốc về việc Hướng dẫn thực hiện Quy chế quản lý tài chính trong hệ thống Ngân hàng Chính sách xã hội (NHCSXH) và văn bản số 5486/NHCS-KTTC ngày 09/6/2025 sửa đổi một số nội dung của văn bản 3358/NHCS-KTTC.</w:t>
@@ -432,9 +388,7 @@
       </w:pPr>
       <w:r>
         <w:rPr>
-          <w:rFonts w:ascii="Times New Roman" w:hAnsi="Times New Roman" w:eastAsia="Times New Roman" w:cs="Times New Roman"/>
-          <w:sz w:val="28"/>
-          <w:szCs w:val="28"/>
+          <w:rFonts w:ascii="Times New Roman" w:hAnsi="Times New Roman"/>
           <w:color w:val="000000"/>
         </w:rPr>
         <w:t>Thực hiện nhiệm vụ được phân công, bộ phận được giao tiếp khách xin lập giấy đề nghị tiếp khách với nội dung cụ thế như sau:</w:t>
@@ -448,27 +402,21 @@
       </w:pPr>
       <w:r>
         <w:rPr>
-          <w:rFonts w:ascii="Times New Roman" w:hAnsi="Times New Roman" w:eastAsia="Times New Roman" w:cs="Times New Roman"/>
-          <w:sz w:val="28"/>
-          <w:szCs w:val="28"/>
+          <w:rFonts w:ascii="Times New Roman" w:hAnsi="Times New Roman"/>
           <w:color w:val="000000"/>
         </w:rPr>
         <w:t xml:space="preserve">Đối tượng tiếp khách: </w:t>
       </w:r>
       <w:r>
         <w:rPr>
-          <w:rFonts w:ascii="Times New Roman" w:hAnsi="Times New Roman" w:eastAsia="Times New Roman" w:cs="Times New Roman"/>
-          <w:sz w:val="28"/>
-          <w:szCs w:val="28"/>
+          <w:rFonts w:ascii="Times New Roman" w:hAnsi="Times New Roman"/>
           <w:color w:val="000000"/>
         </w:rPr>
         <w:t>[[donvitiepkhac]]</w:t>
       </w:r>
       <w:r>
         <w:rPr>
-          <w:rFonts w:ascii="Times New Roman" w:hAnsi="Times New Roman" w:eastAsia="Times New Roman" w:cs="Times New Roman"/>
-          <w:sz w:val="28"/>
-          <w:szCs w:val="28"/>
+          <w:rFonts w:ascii="Times New Roman" w:hAnsi="Times New Roman"/>
           <w:color w:val="000000"/>
         </w:rPr>
         <w:t>.</w:t>
@@ -482,117 +430,84 @@
       </w:pPr>
       <w:r>
         <w:rPr>
-          <w:rFonts w:ascii="Times New Roman" w:hAnsi="Times New Roman" w:eastAsia="Times New Roman" w:cs="Times New Roman"/>
-          <w:sz w:val="28"/>
-          <w:szCs w:val="28"/>
+          <w:rFonts w:ascii="Times New Roman" w:hAnsi="Times New Roman"/>
           <w:color w:val="000000"/>
         </w:rPr>
         <w:t xml:space="preserve">Ngày tiếp khách: </w:t>
       </w:r>
       <w:r>
         <w:rPr>
-          <w:rFonts w:ascii="Times New Roman" w:hAnsi="Times New Roman" w:eastAsia="Times New Roman" w:cs="Times New Roman"/>
-          <w:sz w:val="28"/>
-          <w:szCs w:val="28"/>
+          <w:rFonts w:ascii="Times New Roman" w:hAnsi="Times New Roman"/>
           <w:i/>
         </w:rPr>
         <w:t>[[ngay</w:t>
       </w:r>
       <w:r>
         <w:rPr>
-          <w:rFonts w:ascii="Times New Roman" w:hAnsi="Times New Roman" w:eastAsia="Times New Roman" w:cs="Times New Roman"/>
-          <w:sz w:val="28"/>
-          <w:szCs w:val="28"/>
+          <w:rFonts w:ascii="Times New Roman" w:hAnsi="Times New Roman"/>
           <w:i/>
         </w:rPr>
         <w:t>tk</w:t>
       </w:r>
       <w:r>
         <w:rPr>
-          <w:rFonts w:ascii="Times New Roman" w:hAnsi="Times New Roman" w:eastAsia="Times New Roman" w:cs="Times New Roman"/>
-          <w:sz w:val="28"/>
-          <w:szCs w:val="28"/>
+          <w:rFonts w:ascii="Times New Roman" w:hAnsi="Times New Roman"/>
           <w:i/>
         </w:rPr>
         <w:t>]]</w:t>
       </w:r>
       <w:r>
         <w:rPr>
-          <w:rFonts w:ascii="Times New Roman" w:hAnsi="Times New Roman" w:eastAsia="Times New Roman" w:cs="Times New Roman"/>
-          <w:sz w:val="28"/>
-          <w:szCs w:val="28"/>
+          <w:rFonts w:ascii="Times New Roman" w:hAnsi="Times New Roman"/>
           <w:color w:val="000000"/>
         </w:rPr>
         <w:t>/</w:t>
       </w:r>
       <w:r>
         <w:rPr>
-          <w:rFonts w:ascii="Times New Roman" w:hAnsi="Times New Roman" w:eastAsia="Times New Roman" w:cs="Times New Roman"/>
-          <w:sz w:val="28"/>
-          <w:szCs w:val="28"/>
+          <w:rFonts w:ascii="Times New Roman" w:hAnsi="Times New Roman"/>
           <w:i/>
         </w:rPr>
         <w:t>[[thang</w:t>
       </w:r>
       <w:r>
         <w:rPr>
-          <w:rFonts w:ascii="Times New Roman" w:hAnsi="Times New Roman" w:eastAsia="Times New Roman" w:cs="Times New Roman"/>
-          <w:sz w:val="28"/>
-          <w:szCs w:val="28"/>
+          <w:rFonts w:ascii="Times New Roman" w:hAnsi="Times New Roman"/>
           <w:i/>
         </w:rPr>
         <w:t>tk</w:t>
       </w:r>
       <w:r>
         <w:rPr>
-          <w:rFonts w:ascii="Times New Roman" w:hAnsi="Times New Roman" w:eastAsia="Times New Roman" w:cs="Times New Roman"/>
-          <w:sz w:val="28"/>
-          <w:szCs w:val="28"/>
+          <w:rFonts w:ascii="Times New Roman" w:hAnsi="Times New Roman"/>
           <w:i/>
         </w:rPr>
         <w:t>]]</w:t>
       </w:r>
       <w:r>
         <w:rPr>
-          <w:rFonts w:ascii="Times New Roman" w:hAnsi="Times New Roman" w:eastAsia="Times New Roman" w:cs="Times New Roman"/>
-          <w:sz w:val="28"/>
-          <w:szCs w:val="28"/>
+          <w:rFonts w:ascii="Times New Roman" w:hAnsi="Times New Roman"/>
           <w:color w:val="000000"/>
         </w:rPr>
         <w:t>/</w:t>
       </w:r>
       <w:r>
         <w:rPr>
-          <w:rFonts w:ascii="Times New Roman" w:hAnsi="Times New Roman" w:eastAsia="Times New Roman" w:cs="Times New Roman"/>
-          <w:sz w:val="28"/>
-          <w:szCs w:val="28"/>
+          <w:rFonts w:ascii="Times New Roman" w:hAnsi="Times New Roman"/>
           <w:i/>
         </w:rPr>
-        <w:t xml:space="preserve"> </w:t>
-      </w:r>
-      <w:r>
-        <w:rPr>
-          <w:rFonts w:ascii="Times New Roman" w:hAnsi="Times New Roman" w:eastAsia="Times New Roman" w:cs="Times New Roman"/>
-          <w:sz w:val="28"/>
-          <w:szCs w:val="28"/>
+        <w:t xml:space="preserve"> [[nam</w:t>
+      </w:r>
+      <w:r>
+        <w:rPr>
+          <w:rFonts w:ascii="Times New Roman" w:hAnsi="Times New Roman"/>
           <w:i/>
         </w:rPr>
-        <w:t>[[nam</w:t>
-      </w:r>
-      <w:r>
-        <w:rPr>
-          <w:rFonts w:ascii="Times New Roman" w:hAnsi="Times New Roman" w:eastAsia="Times New Roman" w:cs="Times New Roman"/>
-          <w:sz w:val="28"/>
-          <w:szCs w:val="28"/>
-          <w:i/>
-        </w:rPr>
         <w:t>tk</w:t>
       </w:r>
       <w:r>
         <w:rPr>
-          <w:rFonts w:ascii="Times New Roman" w:hAnsi="Times New Roman" w:eastAsia="Times New Roman" w:cs="Times New Roman"/>
-          <w:sz w:val="28"/>
-          <w:szCs w:val="28"/>
+          <w:rFonts w:ascii="Times New Roman" w:hAnsi="Times New Roman"/>
           <w:i/>
         </w:rPr>
         <w:t>]]</w:t>
@@ -606,45 +521,35 @@
       </w:pPr>
       <w:r>
         <w:rPr>
-          <w:rFonts w:ascii="Times New Roman" w:hAnsi="Times New Roman" w:eastAsia="Times New Roman" w:cs="Times New Roman"/>
-          <w:sz w:val="28"/>
-          <w:szCs w:val="28"/>
+          <w:rFonts w:ascii="Times New Roman" w:hAnsi="Times New Roman"/>
           <w:color w:val="000000"/>
         </w:rPr>
         <w:t xml:space="preserve">Kinh phí dự kiến: </w:t>
       </w:r>
       <w:r>
         <w:rPr>
-          <w:rFonts w:ascii="Times New Roman" w:hAnsi="Times New Roman" w:eastAsia="Times New Roman" w:cs="Times New Roman"/>
-          <w:sz w:val="28"/>
-          <w:szCs w:val="28"/>
+          <w:rFonts w:ascii="Times New Roman" w:hAnsi="Times New Roman"/>
           <w:i/>
         </w:rPr>
         <w:t>[[</w:t>
       </w:r>
       <w:r>
         <w:rPr>
-          <w:rFonts w:ascii="Times New Roman" w:hAnsi="Times New Roman" w:eastAsia="Times New Roman" w:cs="Times New Roman"/>
-          <w:sz w:val="28"/>
-          <w:szCs w:val="28"/>
+          <w:rFonts w:ascii="Times New Roman" w:hAnsi="Times New Roman"/>
           <w:i/>
         </w:rPr>
         <w:t>sotiendukien</w:t>
       </w:r>
       <w:r>
         <w:rPr>
-          <w:rFonts w:ascii="Times New Roman" w:hAnsi="Times New Roman" w:eastAsia="Times New Roman" w:cs="Times New Roman"/>
-          <w:sz w:val="28"/>
-          <w:szCs w:val="28"/>
+          <w:rFonts w:ascii="Times New Roman" w:hAnsi="Times New Roman"/>
           <w:i/>
         </w:rPr>
         <w:t>]]</w:t>
       </w:r>
       <w:r>
         <w:rPr>
-          <w:rFonts w:ascii="Times New Roman" w:hAnsi="Times New Roman" w:eastAsia="Times New Roman" w:cs="Times New Roman"/>
-          <w:sz w:val="28"/>
-          <w:szCs w:val="28"/>
+          <w:rFonts w:ascii="Times New Roman" w:hAnsi="Times New Roman"/>
           <w:color w:val="000000"/>
         </w:rPr>
         <w:t>đ</w:t>
@@ -658,9 +563,7 @@
       </w:pPr>
       <w:r>
         <w:rPr>
-          <w:rFonts w:ascii="Times New Roman" w:hAnsi="Times New Roman" w:eastAsia="Times New Roman" w:cs="Times New Roman"/>
-          <w:sz w:val="28"/>
-          <w:szCs w:val="28"/>
+          <w:rFonts w:ascii="Times New Roman" w:hAnsi="Times New Roman"/>
           <w:i/>
           <w:iCs/>
           <w:color w:val="000000"/>
@@ -669,9 +572,7 @@
       </w:r>
       <w:r>
         <w:rPr>
-          <w:rFonts w:ascii="Times New Roman" w:hAnsi="Times New Roman" w:eastAsia="Times New Roman" w:cs="Times New Roman"/>
-          <w:sz w:val="28"/>
-          <w:szCs w:val="28"/>
+          <w:rFonts w:ascii="Times New Roman" w:hAnsi="Times New Roman"/>
           <w:i/>
           <w:iCs/>
           <w:color w:val="000000"/>
@@ -680,9 +581,7 @@
       </w:r>
       <w:r>
         <w:rPr>
-          <w:rFonts w:ascii="Times New Roman" w:hAnsi="Times New Roman" w:eastAsia="Times New Roman" w:cs="Times New Roman"/>
-          <w:sz w:val="28"/>
-          <w:szCs w:val="28"/>
+          <w:rFonts w:ascii="Times New Roman" w:hAnsi="Times New Roman"/>
           <w:i/>
           <w:iCs/>
           <w:color w:val="000000"/>
@@ -691,45 +590,28 @@
       </w:r>
       <w:r>
         <w:rPr>
-          <w:rFonts w:ascii="Times New Roman" w:hAnsi="Times New Roman" w:eastAsia="Times New Roman" w:cs="Times New Roman"/>
-          <w:sz w:val="28"/>
-          <w:szCs w:val="28"/>
+          <w:rFonts w:ascii="Times New Roman" w:hAnsi="Times New Roman"/>
           <w:i/>
         </w:rPr>
         <w:t>[[</w:t>
       </w:r>
       <w:r>
         <w:rPr>
-          <w:rFonts w:ascii="Times New Roman" w:hAnsi="Times New Roman" w:eastAsia="Times New Roman" w:cs="Times New Roman"/>
-          <w:sz w:val="28"/>
-          <w:szCs w:val="28"/>
+          <w:rFonts w:ascii="Times New Roman" w:hAnsi="Times New Roman"/>
           <w:i/>
         </w:rPr>
-        <w:t>sotiendukien</w:t>
-      </w:r>
-      <w:r>
-        <w:rPr>
-          <w:rFonts w:ascii="Times New Roman" w:hAnsi="Times New Roman" w:eastAsia="Times New Roman" w:cs="Times New Roman"/>
-          <w:sz w:val="28"/>
-          <w:szCs w:val="28"/>
+        <w:t>sotiendukienbangchu</w:t>
+      </w:r>
+      <w:r>
+        <w:rPr>
+          <w:rFonts w:ascii="Times New Roman" w:hAnsi="Times New Roman"/>
           <w:i/>
         </w:rPr>
-        <w:t>bangchu</w:t>
-      </w:r>
-      <w:r>
-        <w:rPr>
-          <w:rFonts w:ascii="Times New Roman" w:hAnsi="Times New Roman" w:eastAsia="Times New Roman" w:cs="Times New Roman"/>
-          <w:sz w:val="28"/>
-          <w:szCs w:val="28"/>
-          <w:i/>
-        </w:rPr>
         <w:t>]]</w:t>
       </w:r>
       <w:r>
         <w:rPr>
-          <w:rFonts w:ascii="Times New Roman" w:hAnsi="Times New Roman" w:eastAsia="Times New Roman" w:cs="Times New Roman"/>
-          <w:sz w:val="28"/>
-          <w:szCs w:val="28"/>
+          <w:rFonts w:ascii="Times New Roman" w:hAnsi="Times New Roman"/>
           <w:i/>
           <w:iCs/>
           <w:color w:val="000000"/>
@@ -738,9 +620,7 @@
       </w:r>
       <w:r>
         <w:rPr>
-          <w:rFonts w:ascii="Times New Roman" w:hAnsi="Times New Roman" w:eastAsia="Times New Roman" w:cs="Times New Roman"/>
-          <w:sz w:val="28"/>
-          <w:szCs w:val="28"/>
+          <w:rFonts w:ascii="Times New Roman" w:hAnsi="Times New Roman"/>
           <w:i/>
           <w:iCs/>
           <w:color w:val="000000"/>
@@ -756,26 +636,20 @@
       </w:pPr>
       <w:r>
         <w:rPr>
-          <w:rFonts w:ascii="Times New Roman" w:hAnsi="Times New Roman" w:eastAsia="Times New Roman" w:cs="Times New Roman"/>
-          <w:sz w:val="28"/>
-          <w:szCs w:val="28"/>
+          <w:rFonts w:ascii="Times New Roman" w:hAnsi="Times New Roman"/>
           <w:color w:val="000000"/>
         </w:rPr>
         <w:t xml:space="preserve">Kính đề nghị </w:t>
       </w:r>
       <w:r>
         <w:rPr>
-          <w:rFonts w:ascii="Times New Roman" w:hAnsi="Times New Roman" w:eastAsia="Times New Roman" w:cs="Times New Roman"/>
-          <w:sz w:val="28"/>
-          <w:szCs w:val="28"/>
+          <w:rFonts w:ascii="Times New Roman" w:hAnsi="Times New Roman"/>
         </w:rPr>
         <w:t>[[gioi_tinhtk]]</w:t>
       </w:r>
       <w:r>
         <w:rPr>
-          <w:rFonts w:ascii="Times New Roman" w:hAnsi="Times New Roman" w:eastAsia="Times New Roman" w:cs="Times New Roman"/>
-          <w:sz w:val="28"/>
-          <w:szCs w:val="28"/>
+          <w:rFonts w:ascii="Times New Roman" w:hAnsi="Times New Roman"/>
           <w:color w:val="000000"/>
         </w:rPr>
         <w:t xml:space="preserve"> xem xét, phê duyệt.</w:t>
@@ -1210,8 +1084,8 @@
               </w:rPr>
               <w:t xml:space="preserve">CỘNG HÒA XÃ HỘI CHỦ NGHĨA VIỆT </w:t>
             </w:r>
-            <w:smartTag w:uri="urn:schemas-microsoft-com:office:smarttags" w:element="country-region">
-              <w:smartTag w:uri="urn:schemas-microsoft-com:office:smarttags" w:element="place">
+            <w:smartTag w:uri="urn:schemas-microsoft-com:office:smarttags" w:element="place">
+              <w:smartTag w:uri="urn:schemas-microsoft-com:office:smarttags" w:element="country-region">
                 <w:r>
                   <w:rPr>
                     <w:rFonts w:ascii="Times New Roman Bold" w:hAnsi="Times New Roman Bold"/>
@@ -1462,197 +1336,49 @@
       </w:pPr>
       <w:r>
         <w:rPr>
-          <w:rFonts w:ascii="Times New Roman" w:hAnsi="Times New Roman" w:eastAsia="Times New Roman" w:cs="Times New Roman"/>
-          <w:sz w:val="28"/>
-          <w:szCs w:val="28"/>
-          <w:color w:val="000000"/>
-        </w:rPr>
-        <w:t>C</w:t>
-      </w:r>
-      <w:r>
-        <w:rPr>
-          <w:rFonts w:ascii="Times New Roman" w:hAnsi="Times New Roman" w:eastAsia="Times New Roman" w:cs="Times New Roman"/>
-          <w:sz w:val="28"/>
-          <w:szCs w:val="28"/>
-          <w:color w:val="000000"/>
-        </w:rPr>
-        <w:t>ă</w:t>
-      </w:r>
-      <w:r>
-        <w:rPr>
-          <w:rFonts w:ascii="Times New Roman" w:hAnsi="Times New Roman" w:eastAsia="Times New Roman" w:cs="Times New Roman"/>
-          <w:sz w:val="28"/>
-          <w:szCs w:val="28"/>
-          <w:color w:val="000000"/>
-        </w:rPr>
-        <w:t xml:space="preserve">n cứ Giấy </w:t>
-      </w:r>
-      <w:r>
-        <w:rPr>
-          <w:rFonts w:ascii="Times New Roman" w:hAnsi="Times New Roman" w:eastAsia="Times New Roman" w:cs="Times New Roman"/>
-          <w:sz w:val="28"/>
-          <w:szCs w:val="28"/>
-          <w:color w:val="000000"/>
-        </w:rPr>
-        <w:t>đ</w:t>
-      </w:r>
-      <w:r>
-        <w:rPr>
-          <w:rFonts w:ascii="Times New Roman" w:hAnsi="Times New Roman" w:eastAsia="Times New Roman" w:cs="Times New Roman"/>
-          <w:sz w:val="28"/>
-          <w:szCs w:val="28"/>
-          <w:color w:val="000000"/>
-        </w:rPr>
-        <w:t xml:space="preserve">ề nghị tiếp khách </w:t>
-      </w:r>
-      <w:r>
-        <w:rPr>
-          <w:rFonts w:ascii="Times New Roman" w:hAnsi="Times New Roman" w:eastAsia="Times New Roman" w:cs="Times New Roman"/>
-          <w:sz w:val="28"/>
-          <w:szCs w:val="28"/>
-          <w:color w:val="000000"/>
-        </w:rPr>
-        <w:t>đã</w:t>
-      </w:r>
-      <w:r>
-        <w:rPr>
-          <w:rFonts w:ascii="Times New Roman" w:hAnsi="Times New Roman" w:eastAsia="Times New Roman" w:cs="Times New Roman"/>
-          <w:sz w:val="28"/>
-          <w:szCs w:val="28"/>
-          <w:color w:val="000000"/>
-        </w:rPr>
-        <w:t xml:space="preserve"> </w:t>
-      </w:r>
-      <w:r>
-        <w:rPr>
-          <w:rFonts w:ascii="Times New Roman" w:hAnsi="Times New Roman" w:eastAsia="Times New Roman" w:cs="Times New Roman"/>
-          <w:sz w:val="28"/>
-          <w:szCs w:val="28"/>
-          <w:color w:val="000000"/>
-        </w:rPr>
-        <w:t>đư</w:t>
-      </w:r>
-      <w:r>
-        <w:rPr>
-          <w:rFonts w:ascii="Times New Roman" w:hAnsi="Times New Roman" w:eastAsia="Times New Roman" w:cs="Times New Roman"/>
-          <w:sz w:val="28"/>
-          <w:szCs w:val="28"/>
-          <w:color w:val="000000"/>
-        </w:rPr>
-        <w:t xml:space="preserve">ợc phê duyệt ngày </w:t>
-      </w:r>
-      <w:r>
-        <w:rPr>
-          <w:rFonts w:ascii="Times New Roman" w:hAnsi="Times New Roman" w:eastAsia="Times New Roman" w:cs="Times New Roman"/>
-          <w:sz w:val="28"/>
-          <w:szCs w:val="28"/>
+          <w:rFonts w:ascii="Times New Roman" w:hAnsi="Times New Roman"/>
+          <w:color w:val="000000"/>
+        </w:rPr>
+        <w:t xml:space="preserve">Căn cứ Giấy đề nghị tiếp khách đã được phê duyệt ngày </w:t>
+      </w:r>
+      <w:r>
+        <w:rPr>
+          <w:rFonts w:ascii="Times New Roman" w:hAnsi="Times New Roman"/>
           <w:color w:val="000000"/>
         </w:rPr>
         <w:t>[[ngaydntk]]/[[thangdntk]]/ [[namdntk]]</w:t>
       </w:r>
       <w:r>
         <w:rPr>
-          <w:rFonts w:ascii="Times New Roman" w:hAnsi="Times New Roman" w:eastAsia="Times New Roman" w:cs="Times New Roman"/>
-          <w:sz w:val="28"/>
-          <w:szCs w:val="28"/>
+          <w:rFonts w:ascii="Times New Roman" w:hAnsi="Times New Roman"/>
           <w:color w:val="000000"/>
         </w:rPr>
         <w:t xml:space="preserve"> của </w:t>
       </w:r>
       <w:r>
         <w:rPr>
-          <w:rFonts w:ascii="Times New Roman" w:hAnsi="Times New Roman" w:eastAsia="Times New Roman" w:cs="Times New Roman"/>
-          <w:sz w:val="28"/>
-          <w:szCs w:val="28"/>
+          <w:rFonts w:ascii="Times New Roman" w:hAnsi="Times New Roman"/>
         </w:rPr>
         <w:t>[[</w:t>
       </w:r>
       <w:r>
         <w:rPr>
-          <w:rFonts w:ascii="Times New Roman" w:hAnsi="Times New Roman" w:eastAsia="Times New Roman" w:cs="Times New Roman"/>
-          <w:sz w:val="28"/>
-          <w:szCs w:val="28"/>
-        </w:rPr>
-        <w:t>PHONGTK</w:t>
-      </w:r>
-      <w:r>
-        <w:rPr>
-          <w:rFonts w:ascii="Times New Roman" w:hAnsi="Times New Roman" w:eastAsia="Times New Roman" w:cs="Times New Roman"/>
-          <w:sz w:val="28"/>
-          <w:szCs w:val="28"/>
-        </w:rPr>
-        <w:t>VT</w:t>
-      </w:r>
-      <w:r>
-        <w:rPr>
-          <w:rFonts w:ascii="Times New Roman" w:hAnsi="Times New Roman" w:eastAsia="Times New Roman" w:cs="Times New Roman"/>
-          <w:sz w:val="28"/>
-          <w:szCs w:val="28"/>
+          <w:rFonts w:ascii="Times New Roman" w:hAnsi="Times New Roman"/>
+        </w:rPr>
+        <w:t>PHONGTKVT</w:t>
+      </w:r>
+      <w:r>
+        <w:rPr>
+          <w:rFonts w:ascii="Times New Roman" w:hAnsi="Times New Roman"/>
         </w:rPr>
         <w:t>]]</w:t>
       </w:r>
       <w:r>
         <w:rPr>
-          <w:rFonts w:ascii="Times New Roman" w:hAnsi="Times New Roman" w:eastAsia="Times New Roman" w:cs="Times New Roman"/>
-          <w:sz w:val="28"/>
-          <w:szCs w:val="28"/>
-          <w:color w:val="000000"/>
-        </w:rPr>
-        <w:t xml:space="preserve">, nay bộ phận </w:t>
-      </w:r>
-      <w:r>
-        <w:rPr>
-          <w:rFonts w:ascii="Times New Roman" w:hAnsi="Times New Roman" w:eastAsia="Times New Roman" w:cs="Times New Roman"/>
-          <w:sz w:val="28"/>
-          <w:szCs w:val="28"/>
-          <w:color w:val="000000"/>
-        </w:rPr>
-        <w:t>đư</w:t>
-      </w:r>
-      <w:r>
-        <w:rPr>
-          <w:rFonts w:ascii="Times New Roman" w:hAnsi="Times New Roman" w:eastAsia="Times New Roman" w:cs="Times New Roman"/>
-          <w:sz w:val="28"/>
-          <w:szCs w:val="28"/>
-          <w:color w:val="000000"/>
-        </w:rPr>
-        <w:t xml:space="preserve">ợc giao tiếp khách </w:t>
-      </w:r>
-      <w:r>
-        <w:rPr>
-          <w:rFonts w:ascii="Times New Roman" w:hAnsi="Times New Roman" w:eastAsia="Times New Roman" w:cs="Times New Roman"/>
-          <w:sz w:val="28"/>
-          <w:szCs w:val="28"/>
-          <w:color w:val="000000"/>
-        </w:rPr>
-        <w:t>đ</w:t>
-      </w:r>
-      <w:r>
-        <w:rPr>
-          <w:rFonts w:ascii="Times New Roman" w:hAnsi="Times New Roman" w:eastAsia="Times New Roman" w:cs="Times New Roman"/>
-          <w:sz w:val="28"/>
-          <w:szCs w:val="28"/>
-          <w:color w:val="000000"/>
-        </w:rPr>
-        <w:t>ề nghị thanh toán chi phí tiếp khách với nội dung nh</w:t>
-      </w:r>
-      <w:r>
-        <w:rPr>
-          <w:rFonts w:ascii="Times New Roman" w:hAnsi="Times New Roman" w:eastAsia="Times New Roman" w:cs="Times New Roman"/>
-          <w:sz w:val="28"/>
-          <w:szCs w:val="28"/>
-          <w:color w:val="000000"/>
-        </w:rPr>
-        <w:t>ư</w:t>
-      </w:r>
-      <w:r>
-        <w:rPr>
-          <w:rFonts w:ascii="Times New Roman" w:hAnsi="Times New Roman" w:eastAsia="Times New Roman" w:cs="Times New Roman"/>
-          <w:sz w:val="28"/>
-          <w:szCs w:val="28"/>
-          <w:color w:val="000000"/>
-        </w:rPr>
-        <w:t xml:space="preserve"> sau:</w:t>
+          <w:rFonts w:ascii="Times New Roman" w:hAnsi="Times New Roman"/>
+          <w:color w:val="000000"/>
+        </w:rPr>
+        <w:t>, nay bộ phận được giao tiếp khách đề nghị thanh toán chi phí tiếp khách với nội dung như sau:</w:t>
       </w:r>
     </w:p>
     <w:p>
@@ -1666,48 +1392,24 @@
       </w:pPr>
       <w:r>
         <w:rPr>
-          <w:rFonts w:ascii="Times New Roman" w:hAnsi="Times New Roman" w:eastAsia="Times New Roman" w:cs="Times New Roman"/>
-          <w:sz w:val="28"/>
-          <w:szCs w:val="28"/>
+          <w:rFonts w:ascii="Times New Roman" w:hAnsi="Times New Roman"/>
           <w:color w:val="000000"/>
         </w:rPr>
         <w:t>1.</w:t>
       </w:r>
       <w:r>
         <w:rPr>
-          <w:rFonts w:ascii="Times New Roman" w:hAnsi="Times New Roman" w:eastAsia="Times New Roman" w:cs="Times New Roman"/>
-          <w:sz w:val="28"/>
-          <w:szCs w:val="28"/>
+          <w:rFonts w:ascii="Times New Roman" w:hAnsi="Times New Roman"/>
           <w:color w:val="000000"/>
         </w:rPr>
         <w:t xml:space="preserve"> </w:t>
       </w:r>
       <w:r>
         <w:rPr>
-          <w:rFonts w:ascii="Times New Roman" w:hAnsi="Times New Roman" w:eastAsia="Times New Roman" w:cs="Times New Roman"/>
-          <w:sz w:val="28"/>
-          <w:szCs w:val="28"/>
-          <w:color w:val="000000"/>
-        </w:rPr>
-        <w:t>Nội dung thanh toán: Tiếp khách c</w:t>
-      </w:r>
-      <w:r>
-        <w:rPr>
-          <w:rFonts w:ascii="Times New Roman" w:hAnsi="Times New Roman" w:eastAsia="Times New Roman" w:cs="Times New Roman"/>
-          <w:sz w:val="28"/>
-          <w:szCs w:val="28"/>
-          <w:color w:val="000000"/>
-        </w:rPr>
-        <w:t>ơ</w:t>
-      </w:r>
-      <w:r>
-        <w:rPr>
-          <w:rFonts w:ascii="Times New Roman" w:hAnsi="Times New Roman" w:eastAsia="Times New Roman" w:cs="Times New Roman"/>
-          <w:sz w:val="28"/>
-          <w:szCs w:val="28"/>
-          <w:color w:val="000000"/>
-        </w:rPr>
-        <w:t xml:space="preserve"> quan</w:t>
+          <w:rFonts w:ascii="Times New Roman" w:hAnsi="Times New Roman"/>
+          <w:color w:val="000000"/>
+        </w:rPr>
+        <w:t>Nội dung thanh toán: Tiếp khách cơ quan</w:t>
       </w:r>
     </w:p>
     <w:p>
@@ -1721,81 +1423,49 @@
       </w:pPr>
       <w:r>
         <w:rPr>
-          <w:rFonts w:ascii="Times New Roman" w:hAnsi="Times New Roman" w:eastAsia="Times New Roman" w:cs="Times New Roman"/>
-          <w:sz w:val="28"/>
-          <w:szCs w:val="28"/>
+          <w:rFonts w:ascii="Times New Roman" w:hAnsi="Times New Roman"/>
           <w:color w:val="000000"/>
         </w:rPr>
         <w:t>2.</w:t>
       </w:r>
       <w:r>
         <w:rPr>
-          <w:rFonts w:ascii="Times New Roman" w:hAnsi="Times New Roman" w:eastAsia="Times New Roman" w:cs="Times New Roman"/>
-          <w:sz w:val="28"/>
-          <w:szCs w:val="28"/>
+          <w:rFonts w:ascii="Times New Roman" w:hAnsi="Times New Roman"/>
           <w:color w:val="000000"/>
         </w:rPr>
         <w:t xml:space="preserve"> </w:t>
       </w:r>
       <w:r>
         <w:rPr>
-          <w:rFonts w:ascii="Times New Roman" w:hAnsi="Times New Roman" w:eastAsia="Times New Roman" w:cs="Times New Roman"/>
-          <w:sz w:val="28"/>
-          <w:szCs w:val="28"/>
-          <w:color w:val="000000"/>
-        </w:rPr>
-        <w:t xml:space="preserve">Số tiền </w:t>
-      </w:r>
-      <w:r>
-        <w:rPr>
-          <w:rFonts w:ascii="Times New Roman" w:hAnsi="Times New Roman" w:eastAsia="Times New Roman" w:cs="Times New Roman"/>
-          <w:sz w:val="28"/>
-          <w:szCs w:val="28"/>
-          <w:color w:val="000000"/>
-        </w:rPr>
-        <w:t>đ</w:t>
-      </w:r>
-      <w:r>
-        <w:rPr>
-          <w:rFonts w:ascii="Times New Roman" w:hAnsi="Times New Roman" w:eastAsia="Times New Roman" w:cs="Times New Roman"/>
-          <w:sz w:val="28"/>
-          <w:szCs w:val="28"/>
-          <w:color w:val="000000"/>
-        </w:rPr>
-        <w:t xml:space="preserve">ề nghị thanh toán: </w:t>
-      </w:r>
-      <w:r>
-        <w:rPr>
-          <w:rFonts w:ascii="Times New Roman" w:hAnsi="Times New Roman" w:eastAsia="Times New Roman" w:cs="Times New Roman"/>
-          <w:sz w:val="28"/>
-          <w:szCs w:val="28"/>
+          <w:rFonts w:ascii="Times New Roman" w:hAnsi="Times New Roman"/>
+          <w:color w:val="000000"/>
+        </w:rPr>
+        <w:t xml:space="preserve">Số tiền đề nghị thanh toán: </w:t>
+      </w:r>
+      <w:r>
+        <w:rPr>
+          <w:rFonts w:ascii="Times New Roman" w:hAnsi="Times New Roman"/>
           <w:color w:val="000000"/>
         </w:rPr>
         <w:t>[[sotien</w:t>
       </w:r>
       <w:r>
         <w:rPr>
-          <w:rFonts w:ascii="Times New Roman" w:hAnsi="Times New Roman" w:eastAsia="Times New Roman" w:cs="Times New Roman"/>
-          <w:sz w:val="28"/>
-          <w:szCs w:val="28"/>
+          <w:rFonts w:ascii="Times New Roman" w:hAnsi="Times New Roman"/>
           <w:color w:val="000000"/>
         </w:rPr>
         <w:t>tt</w:t>
       </w:r>
       <w:r>
         <w:rPr>
-          <w:rFonts w:ascii="Times New Roman" w:hAnsi="Times New Roman" w:eastAsia="Times New Roman" w:cs="Times New Roman"/>
-          <w:sz w:val="28"/>
-          <w:szCs w:val="28"/>
+          <w:rFonts w:ascii="Times New Roman" w:hAnsi="Times New Roman"/>
           <w:color w:val="000000"/>
         </w:rPr>
         <w:t>]]</w:t>
       </w:r>
       <w:r>
         <w:rPr>
-          <w:rFonts w:ascii="Times New Roman" w:hAnsi="Times New Roman" w:eastAsia="Times New Roman" w:cs="Times New Roman"/>
-          <w:sz w:val="28"/>
-          <w:szCs w:val="28"/>
+          <w:rFonts w:ascii="Times New Roman" w:hAnsi="Times New Roman"/>
           <w:color w:val="000000"/>
         </w:rPr>
         <w:t xml:space="preserve"> đồng</w:t>
@@ -1815,9 +1485,7 @@
       </w:pPr>
       <w:r>
         <w:rPr>
-          <w:rFonts w:ascii="Times New Roman" w:hAnsi="Times New Roman" w:eastAsia="Times New Roman" w:cs="Times New Roman"/>
-          <w:sz w:val="28"/>
-          <w:szCs w:val="28"/>
+          <w:rFonts w:ascii="Times New Roman" w:hAnsi="Times New Roman"/>
           <w:i/>
           <w:iCs/>
           <w:color w:val="000000"/>
@@ -1827,9 +1495,7 @@
       </w:r>
       <w:r>
         <w:rPr>
-          <w:rFonts w:ascii="Times New Roman" w:hAnsi="Times New Roman" w:eastAsia="Times New Roman" w:cs="Times New Roman"/>
-          <w:sz w:val="28"/>
-          <w:szCs w:val="28"/>
+          <w:rFonts w:ascii="Times New Roman" w:hAnsi="Times New Roman"/>
           <w:i/>
           <w:iCs/>
           <w:color w:val="000000"/>
@@ -1839,9 +1505,7 @@
       </w:r>
       <w:r>
         <w:rPr>
-          <w:rFonts w:ascii="Times New Roman" w:hAnsi="Times New Roman" w:eastAsia="Times New Roman" w:cs="Times New Roman"/>
-          <w:sz w:val="28"/>
-          <w:szCs w:val="28"/>
+          <w:rFonts w:ascii="Times New Roman" w:hAnsi="Times New Roman"/>
           <w:i/>
           <w:iCs/>
           <w:color w:val="000000"/>
@@ -1851,9 +1515,7 @@
       </w:r>
       <w:r>
         <w:rPr>
-          <w:rFonts w:ascii="Times New Roman" w:hAnsi="Times New Roman" w:eastAsia="Times New Roman" w:cs="Times New Roman"/>
-          <w:sz w:val="28"/>
-          <w:szCs w:val="28"/>
+          <w:rFonts w:ascii="Times New Roman" w:hAnsi="Times New Roman"/>
           <w:i/>
           <w:iCs/>
           <w:color w:val="000000"/>
@@ -1863,9 +1525,7 @@
       </w:r>
       <w:r>
         <w:rPr>
-          <w:rFonts w:ascii="Times New Roman" w:hAnsi="Times New Roman" w:eastAsia="Times New Roman" w:cs="Times New Roman"/>
-          <w:sz w:val="28"/>
-          <w:szCs w:val="28"/>
+          <w:rFonts w:ascii="Times New Roman" w:hAnsi="Times New Roman"/>
           <w:i/>
           <w:iCs/>
           <w:color w:val="000000"/>
@@ -1875,9 +1535,7 @@
       </w:r>
       <w:r>
         <w:rPr>
-          <w:rFonts w:ascii="Times New Roman" w:hAnsi="Times New Roman" w:eastAsia="Times New Roman" w:cs="Times New Roman"/>
-          <w:sz w:val="28"/>
-          <w:szCs w:val="28"/>
+          <w:rFonts w:ascii="Times New Roman" w:hAnsi="Times New Roman"/>
           <w:i/>
           <w:iCs/>
           <w:color w:val="000000"/>
@@ -1897,45 +1555,35 @@
       </w:pPr>
       <w:r>
         <w:rPr>
-          <w:rFonts w:ascii="Times New Roman" w:hAnsi="Times New Roman" w:eastAsia="Times New Roman" w:cs="Times New Roman"/>
-          <w:sz w:val="28"/>
-          <w:szCs w:val="28"/>
+          <w:rFonts w:ascii="Times New Roman" w:hAnsi="Times New Roman"/>
           <w:color w:val="000000"/>
         </w:rPr>
         <w:t>3.</w:t>
       </w:r>
       <w:r>
         <w:rPr>
-          <w:rFonts w:ascii="Times New Roman" w:hAnsi="Times New Roman" w:eastAsia="Times New Roman" w:cs="Times New Roman"/>
-          <w:sz w:val="28"/>
-          <w:szCs w:val="28"/>
+          <w:rFonts w:ascii="Times New Roman" w:hAnsi="Times New Roman"/>
           <w:color w:val="000000"/>
         </w:rPr>
         <w:t xml:space="preserve"> </w:t>
       </w:r>
       <w:r>
         <w:rPr>
-          <w:rFonts w:ascii="Times New Roman" w:hAnsi="Times New Roman" w:eastAsia="Times New Roman" w:cs="Times New Roman"/>
-          <w:sz w:val="28"/>
-          <w:szCs w:val="28"/>
+          <w:rFonts w:ascii="Times New Roman" w:hAnsi="Times New Roman"/>
           <w:color w:val="000000"/>
         </w:rPr>
         <w:t xml:space="preserve">Hình thức thanh toán: </w:t>
       </w:r>
       <w:r>
         <w:rPr>
-          <w:rFonts w:ascii="Times New Roman" w:hAnsi="Times New Roman" w:eastAsia="Times New Roman" w:cs="Times New Roman"/>
-          <w:sz w:val="28"/>
-          <w:szCs w:val="28"/>
+          <w:rFonts w:ascii="Times New Roman" w:hAnsi="Times New Roman"/>
           <w:color w:val="000000"/>
         </w:rPr>
         <w:t>Hoàn tạm ứng</w:t>
       </w:r>
       <w:r>
         <w:rPr>
-          <w:rFonts w:ascii="Times New Roman" w:hAnsi="Times New Roman" w:eastAsia="Times New Roman" w:cs="Times New Roman"/>
-          <w:sz w:val="28"/>
-          <w:szCs w:val="28"/>
+          <w:rFonts w:ascii="Times New Roman" w:hAnsi="Times New Roman"/>
           <w:color w:val="000000"/>
         </w:rPr>
         <w:t>.</w:t>
@@ -1952,66 +1600,24 @@
       </w:pPr>
       <w:r>
         <w:rPr>
-          <w:rFonts w:ascii="Times New Roman" w:hAnsi="Times New Roman" w:eastAsia="Times New Roman" w:cs="Times New Roman"/>
-          <w:sz w:val="28"/>
-          <w:szCs w:val="28"/>
+          <w:rFonts w:ascii="Times New Roman" w:hAnsi="Times New Roman"/>
           <w:color w:val="000000"/>
         </w:rPr>
         <w:t>4.</w:t>
       </w:r>
       <w:r>
         <w:rPr>
-          <w:rFonts w:ascii="Times New Roman" w:hAnsi="Times New Roman" w:eastAsia="Times New Roman" w:cs="Times New Roman"/>
-          <w:sz w:val="28"/>
-          <w:szCs w:val="28"/>
+          <w:rFonts w:ascii="Times New Roman" w:hAnsi="Times New Roman"/>
           <w:color w:val="000000"/>
         </w:rPr>
         <w:t xml:space="preserve"> </w:t>
       </w:r>
       <w:r>
         <w:rPr>
-          <w:rFonts w:ascii="Times New Roman" w:hAnsi="Times New Roman" w:eastAsia="Times New Roman" w:cs="Times New Roman"/>
-          <w:sz w:val="28"/>
-          <w:szCs w:val="28"/>
-          <w:color w:val="000000"/>
-        </w:rPr>
-        <w:t>Hồ s</w:t>
-      </w:r>
-      <w:r>
-        <w:rPr>
-          <w:rFonts w:ascii="Times New Roman" w:hAnsi="Times New Roman" w:eastAsia="Times New Roman" w:cs="Times New Roman"/>
-          <w:sz w:val="28"/>
-          <w:szCs w:val="28"/>
-          <w:color w:val="000000"/>
-        </w:rPr>
-        <w:t>ơ</w:t>
-      </w:r>
-      <w:r>
-        <w:rPr>
-          <w:rFonts w:ascii="Times New Roman" w:hAnsi="Times New Roman" w:eastAsia="Times New Roman" w:cs="Times New Roman"/>
-          <w:sz w:val="28"/>
-          <w:szCs w:val="28"/>
-          <w:color w:val="000000"/>
-        </w:rPr>
-        <w:t xml:space="preserve"> thanh toán </w:t>
-      </w:r>
-      <w:r>
-        <w:rPr>
-          <w:rFonts w:ascii="Times New Roman" w:hAnsi="Times New Roman" w:eastAsia="Times New Roman" w:cs="Times New Roman"/>
-          <w:sz w:val="28"/>
-          <w:szCs w:val="28"/>
-          <w:color w:val="000000"/>
-        </w:rPr>
-        <w:t>đí</w:t>
-      </w:r>
-      <w:r>
-        <w:rPr>
-          <w:rFonts w:ascii="Times New Roman" w:hAnsi="Times New Roman" w:eastAsia="Times New Roman" w:cs="Times New Roman"/>
-          <w:sz w:val="28"/>
-          <w:szCs w:val="28"/>
-          <w:color w:val="000000"/>
-        </w:rPr>
-        <w:t>nh kèm gồm:</w:t>
+          <w:rFonts w:ascii="Times New Roman" w:hAnsi="Times New Roman"/>
+          <w:color w:val="000000"/>
+        </w:rPr>
+        <w:t>Hồ sơ thanh toán đính kèm gồm:</w:t>
       </w:r>
     </w:p>
     <w:p>
@@ -2025,48 +1631,24 @@
       </w:pPr>
       <w:r>
         <w:rPr>
-          <w:rFonts w:ascii="Times New Roman" w:hAnsi="Times New Roman" w:eastAsia="Times New Roman" w:cs="Times New Roman"/>
-          <w:sz w:val="28"/>
-          <w:szCs w:val="28"/>
+          <w:rFonts w:ascii="Times New Roman" w:hAnsi="Times New Roman"/>
           <w:color w:val="000000"/>
         </w:rPr>
         <w:t>-</w:t>
       </w:r>
       <w:r>
         <w:rPr>
-          <w:rFonts w:ascii="Times New Roman" w:hAnsi="Times New Roman" w:eastAsia="Times New Roman" w:cs="Times New Roman"/>
-          <w:sz w:val="28"/>
-          <w:szCs w:val="28"/>
+          <w:rFonts w:ascii="Times New Roman" w:hAnsi="Times New Roman"/>
           <w:color w:val="000000"/>
         </w:rPr>
         <w:t xml:space="preserve"> </w:t>
       </w:r>
       <w:r>
         <w:rPr>
-          <w:rFonts w:ascii="Times New Roman" w:hAnsi="Times New Roman" w:eastAsia="Times New Roman" w:cs="Times New Roman"/>
-          <w:sz w:val="28"/>
-          <w:szCs w:val="28"/>
-          <w:color w:val="000000"/>
-        </w:rPr>
-        <w:t xml:space="preserve">Giấy </w:t>
-      </w:r>
-      <w:r>
-        <w:rPr>
-          <w:rFonts w:ascii="Times New Roman" w:hAnsi="Times New Roman" w:eastAsia="Times New Roman" w:cs="Times New Roman"/>
-          <w:sz w:val="28"/>
-          <w:szCs w:val="28"/>
-          <w:color w:val="000000"/>
-        </w:rPr>
-        <w:t>đ</w:t>
-      </w:r>
-      <w:r>
-        <w:rPr>
-          <w:rFonts w:ascii="Times New Roman" w:hAnsi="Times New Roman" w:eastAsia="Times New Roman" w:cs="Times New Roman"/>
-          <w:sz w:val="28"/>
-          <w:szCs w:val="28"/>
-          <w:color w:val="000000"/>
-        </w:rPr>
-        <w:t>ề nghị tiếp khách;</w:t>
+          <w:rFonts w:ascii="Times New Roman" w:hAnsi="Times New Roman"/>
+          <w:color w:val="000000"/>
+        </w:rPr>
+        <w:t>Giấy đề nghị tiếp khách;</w:t>
       </w:r>
     </w:p>
     <w:p>
@@ -2075,140 +1657,83 @@
         <w:ind w:firstLine="720"/>
         <w:jc w:val="both"/>
         <w:rPr>
-          <w:color w:val="000000"/>
-        </w:rPr>
-      </w:pPr>
-      <w:r>
-        <w:rPr>
-          <w:rFonts w:ascii="Times New Roman" w:hAnsi="Times New Roman" w:eastAsia="Times New Roman" w:cs="Times New Roman"/>
-          <w:sz w:val="28"/>
-          <w:szCs w:val="28"/>
+          <w:rFonts w:ascii="Times New Roman" w:hAnsi="Times New Roman"/>
+          <w:color w:val="000000"/>
+        </w:rPr>
+      </w:pPr>
+      <w:r>
+        <w:rPr>
+          <w:rFonts w:ascii="Times New Roman" w:hAnsi="Times New Roman"/>
           <w:color w:val="000000"/>
         </w:rPr>
         <w:t>-</w:t>
       </w:r>
       <w:r>
         <w:rPr>
-          <w:rFonts w:ascii="Times New Roman" w:hAnsi="Times New Roman" w:eastAsia="Times New Roman" w:cs="Times New Roman"/>
-          <w:sz w:val="28"/>
-          <w:szCs w:val="28"/>
+          <w:rFonts w:ascii="Times New Roman" w:hAnsi="Times New Roman"/>
           <w:color w:val="000000"/>
         </w:rPr>
         <w:t xml:space="preserve"> </w:t>
       </w:r>
       <w:r>
         <w:rPr>
-          <w:rFonts w:ascii="Times New Roman" w:hAnsi="Times New Roman" w:eastAsia="Times New Roman" w:cs="Times New Roman"/>
-          <w:sz w:val="28"/>
-          <w:szCs w:val="28"/>
-          <w:color w:val="000000"/>
-        </w:rPr>
-        <w:t xml:space="preserve">Hóa </w:t>
-      </w:r>
-      <w:r>
-        <w:rPr>
-          <w:rFonts w:ascii="Times New Roman" w:hAnsi="Times New Roman" w:eastAsia="Times New Roman" w:cs="Times New Roman"/>
-          <w:sz w:val="28"/>
-          <w:szCs w:val="28"/>
-          <w:color w:val="000000"/>
-        </w:rPr>
-        <w:t>đơ</w:t>
-      </w:r>
-      <w:r>
-        <w:rPr>
-          <w:rFonts w:ascii="Times New Roman" w:hAnsi="Times New Roman" w:eastAsia="Times New Roman" w:cs="Times New Roman"/>
-          <w:sz w:val="28"/>
-          <w:szCs w:val="28"/>
-          <w:color w:val="000000"/>
-        </w:rPr>
-        <w:t xml:space="preserve">n mã </w:t>
-      </w:r>
-      <w:r>
-        <w:rPr>
-          <w:rFonts w:ascii="Times New Roman" w:hAnsi="Times New Roman" w:eastAsia="Times New Roman" w:cs="Times New Roman"/>
-          <w:sz w:val="28"/>
-          <w:szCs w:val="28"/>
+          <w:rFonts w:ascii="Times New Roman" w:hAnsi="Times New Roman"/>
+          <w:color w:val="000000"/>
+        </w:rPr>
+        <w:t xml:space="preserve">Hóa đơn mã </w:t>
+      </w:r>
+      <w:r>
+        <w:rPr>
+          <w:rFonts w:ascii="Times New Roman" w:hAnsi="Times New Roman"/>
           <w:iCs/>
         </w:rPr>
+        <w:t>[[mahoadon]]</w:t>
+      </w:r>
+      <w:r>
+        <w:rPr>
+          <w:rFonts w:ascii="Times New Roman" w:hAnsi="Times New Roman"/>
+          <w:color w:val="000000"/>
+        </w:rPr>
+        <w:t xml:space="preserve">, số </w:t>
+      </w:r>
+      <w:r>
+        <w:rPr>
+          <w:rFonts w:ascii="Times New Roman" w:hAnsi="Times New Roman"/>
+          <w:iCs/>
+        </w:rPr>
         <w:t>[[</w:t>
       </w:r>
       <w:r>
         <w:rPr>
-          <w:rFonts w:ascii="Times New Roman" w:hAnsi="Times New Roman" w:eastAsia="Times New Roman" w:cs="Times New Roman"/>
-          <w:sz w:val="28"/>
-          <w:szCs w:val="28"/>
+          <w:rFonts w:ascii="Times New Roman" w:hAnsi="Times New Roman"/>
           <w:iCs/>
         </w:rPr>
-        <w:t>mahoadon</w:t>
-      </w:r>
-      <w:r>
-        <w:rPr>
-          <w:rFonts w:ascii="Times New Roman" w:hAnsi="Times New Roman" w:eastAsia="Times New Roman" w:cs="Times New Roman"/>
-          <w:sz w:val="28"/>
-          <w:szCs w:val="28"/>
+        <w:t>so</w:t>
+      </w:r>
+      <w:r>
+        <w:rPr>
+          <w:rFonts w:ascii="Times New Roman" w:hAnsi="Times New Roman"/>
           <w:iCs/>
         </w:rPr>
-        <w:t>]]</w:t>
-      </w:r>
-      <w:r>
-        <w:rPr>
-          <w:rFonts w:ascii="Times New Roman" w:hAnsi="Times New Roman" w:eastAsia="Times New Roman" w:cs="Times New Roman"/>
-          <w:sz w:val="28"/>
-          <w:szCs w:val="28"/>
-          <w:color w:val="000000"/>
-        </w:rPr>
-        <w:t xml:space="preserve">, số </w:t>
-      </w:r>
-      <w:r>
-        <w:rPr>
-          <w:rFonts w:ascii="Times New Roman" w:hAnsi="Times New Roman" w:eastAsia="Times New Roman" w:cs="Times New Roman"/>
-          <w:sz w:val="28"/>
-          <w:szCs w:val="28"/>
-          <w:iCs/>
-        </w:rPr>
-        <w:t>[[</w:t>
-      </w:r>
-      <w:r>
-        <w:rPr>
-          <w:rFonts w:ascii="Times New Roman" w:hAnsi="Times New Roman" w:eastAsia="Times New Roman" w:cs="Times New Roman"/>
-          <w:sz w:val="28"/>
-          <w:szCs w:val="28"/>
-          <w:iCs/>
-        </w:rPr>
-        <w:t>so</w:t>
-      </w:r>
-      <w:r>
-        <w:rPr>
-          <w:rFonts w:ascii="Times New Roman" w:hAnsi="Times New Roman" w:eastAsia="Times New Roman" w:cs="Times New Roman"/>
-          <w:sz w:val="28"/>
-          <w:szCs w:val="28"/>
-          <w:iCs/>
-        </w:rPr>
         <w:t>hoadon]]</w:t>
       </w:r>
       <w:r>
         <w:rPr>
-          <w:rFonts w:ascii="Times New Roman" w:hAnsi="Times New Roman" w:eastAsia="Times New Roman" w:cs="Times New Roman"/>
-          <w:sz w:val="28"/>
-          <w:szCs w:val="28"/>
+          <w:rFonts w:ascii="Times New Roman" w:hAnsi="Times New Roman"/>
           <w:color w:val="000000"/>
         </w:rPr>
         <w:t xml:space="preserve">, ngày </w:t>
       </w:r>
       <w:r>
         <w:rPr>
-          <w:rFonts w:ascii="Times New Roman" w:hAnsi="Times New Roman" w:eastAsia="Times New Roman" w:cs="Times New Roman"/>
-          <w:sz w:val="28"/>
-          <w:szCs w:val="28"/>
+          <w:rFonts w:ascii="Times New Roman" w:hAnsi="Times New Roman"/>
           <w:color w:val="000000"/>
         </w:rPr>
         <w:t>[[ngaytk]]/[[thangtk]]/ [[namtk]]</w:t>
       </w:r>
       <w:r>
         <w:rPr>
-          <w:rFonts w:ascii="Times New Roman" w:hAnsi="Times New Roman" w:eastAsia="Times New Roman" w:cs="Times New Roman"/>
-          <w:sz w:val="28"/>
-          <w:szCs w:val="28"/>
+          <w:rFonts w:ascii="Times New Roman" w:hAnsi="Times New Roman"/>
           <w:color w:val="000000"/>
         </w:rPr>
         <w:t>;</w:t>
@@ -2219,69 +1744,49 @@
         <w:pStyle w:val="BodyText"/>
         <w:ind w:firstLine="720"/>
         <w:jc w:val="both"/>
-      </w:pPr>
-      <w:r>
-        <w:rPr>
-          <w:rFonts w:ascii="Times New Roman" w:hAnsi="Times New Roman" w:eastAsia="Times New Roman" w:cs="Times New Roman"/>
-          <w:sz w:val="28"/>
-          <w:szCs w:val="28"/>
-          <w:color w:val="000000"/>
-        </w:rPr>
-        <w:t xml:space="preserve">Kính </w:t>
-      </w:r>
-      <w:r>
-        <w:rPr>
-          <w:rFonts w:ascii="Times New Roman" w:hAnsi="Times New Roman" w:eastAsia="Times New Roman" w:cs="Times New Roman"/>
-          <w:sz w:val="28"/>
-          <w:szCs w:val="28"/>
-          <w:color w:val="000000"/>
-        </w:rPr>
-        <w:t>đ</w:t>
-      </w:r>
-      <w:r>
-        <w:rPr>
-          <w:rFonts w:ascii="Times New Roman" w:hAnsi="Times New Roman" w:eastAsia="Times New Roman" w:cs="Times New Roman"/>
-          <w:sz w:val="28"/>
-          <w:szCs w:val="28"/>
-          <w:color w:val="000000"/>
-        </w:rPr>
-        <w:t xml:space="preserve">ề nghị </w:t>
-      </w:r>
-      <w:r>
-        <w:rPr>
-          <w:rFonts w:ascii="Times New Roman" w:hAnsi="Times New Roman" w:eastAsia="Times New Roman" w:cs="Times New Roman"/>
-          <w:sz w:val="28"/>
-          <w:szCs w:val="28"/>
+        <w:rPr>
+          <w:color w:val="000000"/>
+        </w:rPr>
+      </w:pPr>
+      <w:r>
+        <w:rPr>
+          <w:color w:val="000000"/>
+        </w:rPr>
+        <w:t xml:space="preserve">- </w:t>
+      </w:r>
+      <w:r>
+        <w:rPr>
+          <w:color w:val="000000"/>
+        </w:rPr>
+        <w:t>Phụ lục bảng kê chi tiết đề nghị thanh toán</w:t>
+      </w:r>
+    </w:p>
+    <w:p>
+      <w:pPr>
+        <w:pStyle w:val="BodyText"/>
+        <w:ind w:firstLine="720"/>
+        <w:jc w:val="both"/>
+      </w:pPr>
+      <w:r>
+        <w:rPr>
+          <w:rFonts w:ascii="Times New Roman" w:hAnsi="Times New Roman"/>
+          <w:color w:val="000000"/>
+        </w:rPr>
+        <w:t xml:space="preserve">Kính đề nghị </w:t>
+      </w:r>
+      <w:r>
+        <w:rPr>
+          <w:rFonts w:ascii="Times New Roman" w:hAnsi="Times New Roman"/>
           <w:color w:val="000000"/>
         </w:rPr>
         <w:t>[[gioi_tinhtt]]</w:t>
       </w:r>
       <w:r>
         <w:rPr>
-          <w:rFonts w:ascii="Times New Roman" w:hAnsi="Times New Roman" w:eastAsia="Times New Roman" w:cs="Times New Roman"/>
-          <w:sz w:val="28"/>
-          <w:szCs w:val="28"/>
-          <w:color w:val="000000"/>
-        </w:rPr>
-        <w:t xml:space="preserve"> xem xét, phê duyệt thanh toán theo quy </w:t>
-      </w:r>
-      <w:r>
-        <w:rPr>
-          <w:rFonts w:ascii="Times New Roman" w:hAnsi="Times New Roman" w:eastAsia="Times New Roman" w:cs="Times New Roman"/>
-          <w:sz w:val="28"/>
-          <w:szCs w:val="28"/>
-          <w:color w:val="000000"/>
-        </w:rPr>
-        <w:t>đ</w:t>
-      </w:r>
-      <w:r>
-        <w:rPr>
-          <w:rFonts w:ascii="Times New Roman" w:hAnsi="Times New Roman" w:eastAsia="Times New Roman" w:cs="Times New Roman"/>
-          <w:sz w:val="28"/>
-          <w:szCs w:val="28"/>
-          <w:color w:val="000000"/>
-        </w:rPr>
-        <w:t>ịnh.</w:t>
+          <w:rFonts w:ascii="Times New Roman" w:hAnsi="Times New Roman"/>
+          <w:color w:val="000000"/>
+        </w:rPr>
+        <w:t xml:space="preserve"> xem xét, phê duyệt thanh toán theo quy định.</w:t>
       </w:r>
     </w:p>
     <w:p>
@@ -2718,6 +2223,843 @@
         <w:jc w:val="both"/>
       </w:pPr>
     </w:p>
+    <w:p>
+      <w:pPr>
+        <w:spacing w:before="120" w:after="120"/>
+        <w:jc w:val="center"/>
+      </w:pPr>
+      <w:r>
+        <w:br w:type="page"/>
+      </w:r>
+      <w:r>
+        <w:rPr>
+          <w:b/>
+        </w:rPr>
+        <w:lastRenderedPageBreak/>
+        <w:t>PHỤ LỤC BẢNG KÊ CHI TIẾT ĐỀ NGHỊ THANH TOÁN</w:t>
+      </w:r>
+    </w:p>
+    <w:p>
+      <w:pPr>
+        <w:spacing w:before="120" w:after="120"/>
+        <w:jc w:val="center"/>
+        <w:rPr>
+          <w:szCs w:val="26"/>
+        </w:rPr>
+      </w:pPr>
+      <w:r>
+        <w:rPr>
+          <w:szCs w:val="26"/>
+        </w:rPr>
+        <w:t>(Kèm theo Giấy đề nghị thanh toán ngày [[ngaydntk]]/[[thangdntk]]/ [[namdntk]])</w:t>
+      </w:r>
+    </w:p>
+    <w:p>
+      <w:pPr>
+        <w:spacing w:before="120" w:after="120"/>
+        <w:ind w:firstLine="720"/>
+        <w:jc w:val="both"/>
+      </w:pPr>
+      <w:r>
+        <w:t>Căn cứ Hóa đơn mã</w:t>
+      </w:r>
+      <w:r>
+        <w:t xml:space="preserve"> số</w:t>
+      </w:r>
+      <w:r>
+        <w:t xml:space="preserve"> [[mahoadon]], số [[sohoadon]], ngày [[ngaytk]]/[[thangtk]]/ [[namtk]] của [[benban]].</w:t>
+      </w:r>
+    </w:p>
+    <w:p>
+      <w:pPr>
+        <w:spacing w:before="120" w:after="120"/>
+        <w:ind w:firstLine="720"/>
+        <w:jc w:val="both"/>
+      </w:pPr>
+      <w:r>
+        <w:t>Chi tiết phân loại chi phí các khoản đề nghị thanh toán và không đề nghị thanh toán như sau:</w:t>
+      </w:r>
+    </w:p>
+    <w:p>
+      <w:pPr>
+        <w:spacing w:before="120" w:after="120"/>
+        <w:ind w:right="-427" w:firstLine="7938"/>
+        <w:jc w:val="both"/>
+      </w:pPr>
+      <w:r>
+        <w:t>Đơn vị: đồng</w:t>
+      </w:r>
+    </w:p>
+    <w:tbl>
+      <w:tblPr>
+        <w:tblW w:w="10632" w:type="dxa"/>
+        <w:tblInd w:w="-998" w:type="dxa"/>
+        <w:tblBorders>
+          <w:top w:val="single" w:sz="4" w:space="0" w:color="auto"/>
+          <w:left w:val="single" w:sz="4" w:space="0" w:color="auto"/>
+          <w:bottom w:val="single" w:sz="4" w:space="0" w:color="auto"/>
+          <w:right w:val="single" w:sz="4" w:space="0" w:color="auto"/>
+          <w:insideH w:val="single" w:sz="4" w:space="0" w:color="auto"/>
+          <w:insideV w:val="single" w:sz="4" w:space="0" w:color="auto"/>
+        </w:tblBorders>
+        <w:tblLook w:val="04A0" w:firstRow="1" w:lastRow="0" w:firstColumn="1" w:lastColumn="0" w:noHBand="0" w:noVBand="1"/>
+      </w:tblPr>
+      <w:tblGrid>
+        <w:gridCol w:w="747"/>
+        <w:gridCol w:w="2807"/>
+        <w:gridCol w:w="1165"/>
+        <w:gridCol w:w="1242"/>
+        <w:gridCol w:w="1824"/>
+        <w:gridCol w:w="1573"/>
+        <w:gridCol w:w="1274"/>
+      </w:tblGrid>
+      <w:tr>
+        <w:trPr>
+          <w:trHeight w:val="698"/>
+        </w:trPr>
+        <w:tc>
+          <w:tcPr>
+            <w:tcW w:w="747" w:type="dxa"/>
+            <w:vAlign w:val="center"/>
+          </w:tcPr>
+          <w:p>
+            <w:pPr>
+              <w:jc w:val="center"/>
+              <w:rPr>
+                <w:b/>
+                <w:bCs/>
+              </w:rPr>
+            </w:pPr>
+            <w:r>
+              <w:rPr>
+                <w:b/>
+                <w:bCs/>
+              </w:rPr>
+              <w:t>STT</w:t>
+            </w:r>
+          </w:p>
+        </w:tc>
+        <w:tc>
+          <w:tcPr>
+            <w:tcW w:w="2807" w:type="dxa"/>
+            <w:vAlign w:val="center"/>
+          </w:tcPr>
+          <w:p>
+            <w:pPr>
+              <w:jc w:val="center"/>
+              <w:rPr>
+                <w:b/>
+                <w:bCs/>
+              </w:rPr>
+            </w:pPr>
+            <w:r>
+              <w:rPr>
+                <w:b/>
+                <w:bCs/>
+              </w:rPr>
+              <w:t>Nội dung</w:t>
+            </w:r>
+          </w:p>
+        </w:tc>
+        <w:tc>
+          <w:tcPr>
+            <w:tcW w:w="1165" w:type="dxa"/>
+            <w:vAlign w:val="center"/>
+          </w:tcPr>
+          <w:p>
+            <w:pPr>
+              <w:jc w:val="center"/>
+              <w:rPr>
+                <w:b/>
+                <w:bCs/>
+              </w:rPr>
+            </w:pPr>
+            <w:r>
+              <w:rPr>
+                <w:b/>
+                <w:bCs/>
+              </w:rPr>
+              <w:t>Số lượng</w:t>
+            </w:r>
+          </w:p>
+        </w:tc>
+        <w:tc>
+          <w:tcPr>
+            <w:tcW w:w="1242" w:type="dxa"/>
+            <w:vAlign w:val="center"/>
+          </w:tcPr>
+          <w:p>
+            <w:pPr>
+              <w:jc w:val="center"/>
+              <w:rPr>
+                <w:b/>
+                <w:bCs/>
+              </w:rPr>
+            </w:pPr>
+            <w:r>
+              <w:rPr>
+                <w:b/>
+                <w:bCs/>
+              </w:rPr>
+              <w:t>Đơn giá</w:t>
+            </w:r>
+          </w:p>
+        </w:tc>
+        <w:tc>
+          <w:tcPr>
+            <w:tcW w:w="1824" w:type="dxa"/>
+            <w:vAlign w:val="center"/>
+          </w:tcPr>
+          <w:p>
+            <w:pPr>
+              <w:jc w:val="center"/>
+              <w:rPr>
+                <w:b/>
+                <w:bCs/>
+              </w:rPr>
+            </w:pPr>
+            <w:r>
+              <w:rPr>
+                <w:b/>
+                <w:bCs/>
+              </w:rPr>
+              <w:t>Tiền thuế</w:t>
+            </w:r>
+          </w:p>
+          <w:p>
+            <w:pPr>
+              <w:jc w:val="center"/>
+              <w:rPr>
+                <w:b/>
+                <w:bCs/>
+              </w:rPr>
+            </w:pPr>
+            <w:r>
+              <w:rPr>
+                <w:b/>
+                <w:bCs/>
+              </w:rPr>
+              <w:t>GTGT</w:t>
+            </w:r>
+          </w:p>
+          <w:p>
+            <w:pPr>
+              <w:jc w:val="center"/>
+              <w:rPr>
+                <w:b/>
+                <w:bCs/>
+              </w:rPr>
+            </w:pPr>
+            <w:r>
+              <w:rPr>
+                <w:b/>
+                <w:bCs/>
+              </w:rPr>
+              <w:t>(nếu có)</w:t>
+            </w:r>
+          </w:p>
+        </w:tc>
+        <w:tc>
+          <w:tcPr>
+            <w:tcW w:w="1573" w:type="dxa"/>
+            <w:vAlign w:val="center"/>
+          </w:tcPr>
+          <w:p>
+            <w:pPr>
+              <w:jc w:val="center"/>
+              <w:rPr>
+                <w:b/>
+                <w:bCs/>
+              </w:rPr>
+            </w:pPr>
+            <w:r>
+              <w:rPr>
+                <w:b/>
+                <w:bCs/>
+              </w:rPr>
+              <w:t>Thành tiền</w:t>
+            </w:r>
+          </w:p>
+          <w:p>
+            <w:pPr>
+              <w:jc w:val="center"/>
+              <w:rPr>
+                <w:b/>
+                <w:bCs/>
+              </w:rPr>
+            </w:pPr>
+            <w:r>
+              <w:rPr>
+                <w:b/>
+                <w:bCs/>
+              </w:rPr>
+              <w:t>(Bao gồm thuế GTGT)</w:t>
+            </w:r>
+          </w:p>
+        </w:tc>
+        <w:tc>
+          <w:tcPr>
+            <w:tcW w:w="1274" w:type="dxa"/>
+            <w:vAlign w:val="center"/>
+          </w:tcPr>
+          <w:p>
+            <w:pPr>
+              <w:jc w:val="center"/>
+              <w:rPr>
+                <w:b/>
+                <w:bCs/>
+              </w:rPr>
+            </w:pPr>
+            <w:r>
+              <w:rPr>
+                <w:b/>
+                <w:bCs/>
+              </w:rPr>
+              <w:t>Ghi chú</w:t>
+            </w:r>
+          </w:p>
+        </w:tc>
+      </w:tr>
+      <w:tr>
+        <w:tc>
+          <w:tcPr>
+            <w:tcW w:w="747" w:type="dxa"/>
+            <w:vAlign w:val="center"/>
+          </w:tcPr>
+          <w:p>
+            <w:pPr>
+              <w:spacing w:before="120" w:after="120"/>
+              <w:jc w:val="center"/>
+            </w:pPr>
+            <w:r>
+              <w:rPr>
+                <w:b/>
+              </w:rPr>
+              <w:t>I</w:t>
+            </w:r>
+          </w:p>
+        </w:tc>
+        <w:tc>
+          <w:tcPr>
+            <w:tcW w:w="7038" w:type="dxa"/>
+            <w:gridSpan w:val="4"/>
+            <w:vAlign w:val="center"/>
+          </w:tcPr>
+          <w:p>
+            <w:pPr>
+              <w:spacing w:before="120" w:after="120"/>
+            </w:pPr>
+            <w:r>
+              <w:rPr>
+                <w:b/>
+              </w:rPr>
+              <w:t>Các khoản đề nghị thanh toán</w:t>
+            </w:r>
+          </w:p>
+        </w:tc>
+        <w:tc>
+          <w:tcPr>
+            <w:tcW w:w="1573" w:type="dxa"/>
+            <w:vAlign w:val="center"/>
+          </w:tcPr>
+          <w:p>
+            <w:pPr>
+              <w:spacing w:before="120" w:after="120"/>
+            </w:pPr>
+          </w:p>
+        </w:tc>
+        <w:tc>
+          <w:tcPr>
+            <w:tcW w:w="1274" w:type="dxa"/>
+            <w:vAlign w:val="center"/>
+          </w:tcPr>
+          <w:p>
+            <w:pPr>
+              <w:spacing w:before="120" w:after="120"/>
+            </w:pPr>
+          </w:p>
+        </w:tc>
+      </w:tr>
+      <w:tr>
+        <w:tc>
+          <w:tcPr>
+            <w:tcW w:w="747" w:type="dxa"/>
+            <w:vAlign w:val="center"/>
+          </w:tcPr>
+          <w:p>
+            <w:pPr>
+              <w:spacing w:before="120" w:after="120"/>
+              <w:jc w:val="center"/>
+            </w:pPr>
+          </w:p>
+        </w:tc>
+        <w:tc>
+          <w:tcPr>
+            <w:tcW w:w="2807" w:type="dxa"/>
+            <w:vAlign w:val="center"/>
+          </w:tcPr>
+          <w:p>
+            <w:pPr>
+              <w:spacing w:before="120" w:after="120"/>
+            </w:pPr>
+          </w:p>
+        </w:tc>
+        <w:tc>
+          <w:tcPr>
+            <w:tcW w:w="1165" w:type="dxa"/>
+            <w:vAlign w:val="center"/>
+          </w:tcPr>
+          <w:p>
+            <w:pPr>
+              <w:spacing w:before="120" w:after="120"/>
+              <w:jc w:val="center"/>
+            </w:pPr>
+          </w:p>
+        </w:tc>
+        <w:tc>
+          <w:tcPr>
+            <w:tcW w:w="1242" w:type="dxa"/>
+            <w:vAlign w:val="center"/>
+          </w:tcPr>
+          <w:p>
+            <w:pPr>
+              <w:spacing w:before="120" w:after="120"/>
+              <w:jc w:val="right"/>
+            </w:pPr>
+          </w:p>
+        </w:tc>
+        <w:tc>
+          <w:tcPr>
+            <w:tcW w:w="1824" w:type="dxa"/>
+            <w:vAlign w:val="center"/>
+          </w:tcPr>
+          <w:p>
+            <w:pPr>
+              <w:spacing w:before="120" w:after="120"/>
+              <w:jc w:val="right"/>
+            </w:pPr>
+          </w:p>
+        </w:tc>
+        <w:tc>
+          <w:tcPr>
+            <w:tcW w:w="1573" w:type="dxa"/>
+            <w:vAlign w:val="center"/>
+          </w:tcPr>
+          <w:p>
+            <w:pPr>
+              <w:spacing w:before="120" w:after="120"/>
+              <w:jc w:val="right"/>
+            </w:pPr>
+          </w:p>
+        </w:tc>
+        <w:tc>
+          <w:tcPr>
+            <w:tcW w:w="1274" w:type="dxa"/>
+            <w:vAlign w:val="center"/>
+          </w:tcPr>
+          <w:p>
+            <w:pPr>
+              <w:spacing w:before="120" w:after="120"/>
+              <w:jc w:val="right"/>
+            </w:pPr>
+          </w:p>
+        </w:tc>
+      </w:tr>
+      <w:tr>
+        <w:tc>
+          <w:tcPr>
+            <w:tcW w:w="747" w:type="dxa"/>
+            <w:vAlign w:val="center"/>
+          </w:tcPr>
+          <w:p>
+            <w:pPr>
+              <w:spacing w:before="120" w:after="120"/>
+              <w:jc w:val="center"/>
+            </w:pPr>
+          </w:p>
+        </w:tc>
+        <w:tc>
+          <w:tcPr>
+            <w:tcW w:w="2807" w:type="dxa"/>
+            <w:vAlign w:val="center"/>
+          </w:tcPr>
+          <w:p>
+            <w:pPr>
+              <w:spacing w:before="120" w:after="120"/>
+            </w:pPr>
+          </w:p>
+        </w:tc>
+        <w:tc>
+          <w:tcPr>
+            <w:tcW w:w="1165" w:type="dxa"/>
+            <w:vAlign w:val="center"/>
+          </w:tcPr>
+          <w:p>
+            <w:pPr>
+              <w:spacing w:before="120" w:after="120"/>
+              <w:jc w:val="center"/>
+            </w:pPr>
+          </w:p>
+        </w:tc>
+        <w:tc>
+          <w:tcPr>
+            <w:tcW w:w="1242" w:type="dxa"/>
+            <w:vAlign w:val="center"/>
+          </w:tcPr>
+          <w:p>
+            <w:pPr>
+              <w:spacing w:before="120" w:after="120"/>
+              <w:jc w:val="right"/>
+            </w:pPr>
+          </w:p>
+        </w:tc>
+        <w:tc>
+          <w:tcPr>
+            <w:tcW w:w="1824" w:type="dxa"/>
+            <w:vAlign w:val="center"/>
+          </w:tcPr>
+          <w:p>
+            <w:pPr>
+              <w:spacing w:before="120" w:after="120"/>
+              <w:jc w:val="right"/>
+            </w:pPr>
+          </w:p>
+        </w:tc>
+        <w:tc>
+          <w:tcPr>
+            <w:tcW w:w="1573" w:type="dxa"/>
+            <w:vAlign w:val="center"/>
+          </w:tcPr>
+          <w:p>
+            <w:pPr>
+              <w:spacing w:before="120" w:after="120"/>
+              <w:jc w:val="right"/>
+            </w:pPr>
+          </w:p>
+        </w:tc>
+        <w:tc>
+          <w:tcPr>
+            <w:tcW w:w="1274" w:type="dxa"/>
+            <w:vAlign w:val="center"/>
+          </w:tcPr>
+          <w:p>
+            <w:pPr>
+              <w:spacing w:before="120" w:after="120"/>
+              <w:jc w:val="right"/>
+            </w:pPr>
+          </w:p>
+        </w:tc>
+      </w:tr>
+      <w:tr>
+        <w:tc>
+          <w:tcPr>
+            <w:tcW w:w="747" w:type="dxa"/>
+            <w:vAlign w:val="center"/>
+          </w:tcPr>
+          <w:p>
+            <w:pPr>
+              <w:spacing w:before="120" w:after="120"/>
+              <w:jc w:val="center"/>
+            </w:pPr>
+            <w:r>
+              <w:rPr>
+                <w:b/>
+              </w:rPr>
+              <w:t>II</w:t>
+            </w:r>
+          </w:p>
+        </w:tc>
+        <w:tc>
+          <w:tcPr>
+            <w:tcW w:w="7038" w:type="dxa"/>
+            <w:gridSpan w:val="4"/>
+            <w:vAlign w:val="center"/>
+          </w:tcPr>
+          <w:p>
+            <w:pPr>
+              <w:spacing w:before="120" w:after="120"/>
+            </w:pPr>
+            <w:r>
+              <w:rPr>
+                <w:b/>
+              </w:rPr>
+              <w:t>Các khoản không đề nghị thanh toán</w:t>
+            </w:r>
+          </w:p>
+        </w:tc>
+        <w:tc>
+          <w:tcPr>
+            <w:tcW w:w="1573" w:type="dxa"/>
+            <w:vAlign w:val="center"/>
+          </w:tcPr>
+          <w:p>
+            <w:pPr>
+              <w:spacing w:before="120" w:after="120"/>
+            </w:pPr>
+          </w:p>
+        </w:tc>
+        <w:tc>
+          <w:tcPr>
+            <w:tcW w:w="1274" w:type="dxa"/>
+            <w:vAlign w:val="center"/>
+          </w:tcPr>
+          <w:p>
+            <w:pPr>
+              <w:spacing w:before="120" w:after="120"/>
+            </w:pPr>
+          </w:p>
+        </w:tc>
+      </w:tr>
+      <w:tr>
+        <w:tc>
+          <w:tcPr>
+            <w:tcW w:w="747" w:type="dxa"/>
+            <w:vAlign w:val="center"/>
+          </w:tcPr>
+          <w:p>
+            <w:pPr>
+              <w:spacing w:before="120" w:after="120"/>
+              <w:jc w:val="center"/>
+            </w:pPr>
+          </w:p>
+        </w:tc>
+        <w:tc>
+          <w:tcPr>
+            <w:tcW w:w="2807" w:type="dxa"/>
+            <w:vAlign w:val="center"/>
+          </w:tcPr>
+          <w:p>
+            <w:pPr>
+              <w:spacing w:before="120" w:after="120"/>
+            </w:pPr>
+          </w:p>
+        </w:tc>
+        <w:tc>
+          <w:tcPr>
+            <w:tcW w:w="1165" w:type="dxa"/>
+            <w:vAlign w:val="center"/>
+          </w:tcPr>
+          <w:p>
+            <w:pPr>
+              <w:spacing w:before="120" w:after="120"/>
+              <w:jc w:val="center"/>
+            </w:pPr>
+          </w:p>
+        </w:tc>
+        <w:tc>
+          <w:tcPr>
+            <w:tcW w:w="1242" w:type="dxa"/>
+            <w:vAlign w:val="center"/>
+          </w:tcPr>
+          <w:p>
+            <w:pPr>
+              <w:spacing w:before="120" w:after="120"/>
+              <w:jc w:val="right"/>
+            </w:pPr>
+          </w:p>
+        </w:tc>
+        <w:tc>
+          <w:tcPr>
+            <w:tcW w:w="1824" w:type="dxa"/>
+            <w:vAlign w:val="center"/>
+          </w:tcPr>
+          <w:p>
+            <w:pPr>
+              <w:spacing w:before="120" w:after="120"/>
+              <w:jc w:val="right"/>
+            </w:pPr>
+          </w:p>
+        </w:tc>
+        <w:tc>
+          <w:tcPr>
+            <w:tcW w:w="1573" w:type="dxa"/>
+            <w:vAlign w:val="center"/>
+          </w:tcPr>
+          <w:p>
+            <w:pPr>
+              <w:spacing w:before="120" w:after="120"/>
+              <w:jc w:val="right"/>
+            </w:pPr>
+          </w:p>
+        </w:tc>
+        <w:tc>
+          <w:tcPr>
+            <w:tcW w:w="1274" w:type="dxa"/>
+            <w:vAlign w:val="center"/>
+          </w:tcPr>
+          <w:p>
+            <w:pPr>
+              <w:spacing w:before="120" w:after="120"/>
+              <w:jc w:val="right"/>
+            </w:pPr>
+          </w:p>
+        </w:tc>
+      </w:tr>
+      <w:tr>
+        <w:tc>
+          <w:tcPr>
+            <w:tcW w:w="747" w:type="dxa"/>
+            <w:vAlign w:val="center"/>
+          </w:tcPr>
+          <w:p>
+            <w:pPr>
+              <w:jc w:val="center"/>
+            </w:pPr>
+          </w:p>
+        </w:tc>
+        <w:tc>
+          <w:tcPr>
+            <w:tcW w:w="7038" w:type="dxa"/>
+            <w:gridSpan w:val="4"/>
+            <w:vAlign w:val="center"/>
+          </w:tcPr>
+          <w:p>
+            <w:pPr>
+              <w:spacing w:before="120" w:after="120"/>
+            </w:pPr>
+            <w:r>
+              <w:rPr>
+                <w:b/>
+              </w:rPr>
+              <w:t>TỔNG CỘNG HÓA ĐƠN</w:t>
+            </w:r>
+          </w:p>
+        </w:tc>
+        <w:tc>
+          <w:tcPr>
+            <w:tcW w:w="1573" w:type="dxa"/>
+            <w:vAlign w:val="center"/>
+          </w:tcPr>
+          <w:p>
+            <w:pPr>
+              <w:spacing w:before="120" w:after="120"/>
+              <w:jc w:val="right"/>
+            </w:pPr>
+          </w:p>
+        </w:tc>
+        <w:tc>
+          <w:tcPr>
+            <w:tcW w:w="1274" w:type="dxa"/>
+            <w:vAlign w:val="center"/>
+          </w:tcPr>
+          <w:p>
+            <w:pPr>
+              <w:spacing w:before="120" w:after="120"/>
+              <w:jc w:val="right"/>
+            </w:pPr>
+          </w:p>
+        </w:tc>
+      </w:tr>
+    </w:tbl>
+    <w:p>
+      <w:pPr>
+        <w:spacing w:before="120" w:after="120"/>
+        <w:ind w:firstLine="720"/>
+        <w:jc w:val="both"/>
+        <w:rPr>
+          <w:i/>
+          <w:iCs/>
+        </w:rPr>
+      </w:pPr>
+      <w:r>
+        <w:t xml:space="preserve">Tổng số tiền đề nghị thanh toán: [[sotientt]] đồng </w:t>
+      </w:r>
+      <w:r>
+        <w:rPr>
+          <w:i/>
+          <w:iCs/>
+        </w:rPr>
+        <w:t>(Bằng chữ: [[sotienttbangchu]] đồng)</w:t>
+      </w:r>
+    </w:p>
+    <w:tbl>
+      <w:tblPr>
+        <w:tblW w:w="0" w:type="auto"/>
+        <w:tblLook w:val="04A0" w:firstRow="1" w:lastRow="0" w:firstColumn="1" w:lastColumn="0" w:noHBand="0" w:noVBand="1"/>
+      </w:tblPr>
+      <w:tblGrid>
+        <w:gridCol w:w="4530"/>
+        <w:gridCol w:w="4531"/>
+      </w:tblGrid>
+      <w:tr>
+        <w:tc>
+          <w:tcPr>
+            <w:tcW w:w="4530" w:type="dxa"/>
+          </w:tcPr>
+          <w:p>
+            <w:pPr>
+              <w:spacing w:before="120" w:after="120"/>
+              <w:jc w:val="center"/>
+            </w:pPr>
+          </w:p>
+        </w:tc>
+        <w:tc>
+          <w:tcPr>
+            <w:tcW w:w="4531" w:type="dxa"/>
+          </w:tcPr>
+          <w:p>
+            <w:pPr>
+              <w:jc w:val="center"/>
+              <w:rPr>
+                <w:b/>
+                <w:bCs/>
+              </w:rPr>
+            </w:pPr>
+            <w:r>
+              <w:rPr>
+                <w:b/>
+                <w:bCs/>
+              </w:rPr>
+              <w:t>Người đề nghị</w:t>
+            </w:r>
+          </w:p>
+          <w:p>
+            <w:pPr>
+              <w:jc w:val="center"/>
+            </w:pPr>
+          </w:p>
+          <w:p>
+            <w:pPr>
+              <w:jc w:val="center"/>
+            </w:pPr>
+          </w:p>
+          <w:p>
+            <w:pPr>
+              <w:jc w:val="center"/>
+            </w:pPr>
+          </w:p>
+          <w:p>
+            <w:pPr>
+              <w:jc w:val="center"/>
+            </w:pPr>
+          </w:p>
+          <w:p>
+            <w:pPr>
+              <w:jc w:val="center"/>
+              <w:rPr>
+                <w:b/>
+                <w:bCs/>
+              </w:rPr>
+            </w:pPr>
+            <w:r>
+              <w:rPr>
+                <w:b/>
+                <w:bCs/>
+              </w:rPr>
+              <w:t>[[nguoidntk]]</w:t>
+            </w:r>
+          </w:p>
+        </w:tc>
+      </w:tr>
+    </w:tbl>
+    <w:p>
+      <w:pPr>
+        <w:spacing w:before="120" w:after="120"/>
+        <w:ind w:firstLine="720"/>
+        <w:jc w:val="both"/>
+      </w:pPr>
+    </w:p>
+    <w:p/>
     <w:p>
       <w:pPr>
         <w:tabs>
@@ -5522,6 +5864,7 @@
     <w:lsdException w:name="Table Web 1" w:semiHidden="1" w:unhideWhenUsed="1"/>
     <w:lsdException w:name="Table Web 2" w:semiHidden="1" w:unhideWhenUsed="1"/>
     <w:lsdException w:name="Table Web 3" w:semiHidden="1" w:unhideWhenUsed="1"/>
+    <w:lsdException w:name="Table Grid" w:uiPriority="59"/>
     <w:lsdException w:name="Table Theme" w:semiHidden="1" w:unhideWhenUsed="1"/>
     <w:lsdException w:name="Placeholder Text" w:semiHidden="1" w:uiPriority="99"/>
     <w:lsdException w:name="No Spacing" w:uiPriority="1" w:qFormat="1"/>
@@ -5832,6 +6175,7 @@
   <w:style w:type="table" w:styleId="TableGrid">
     <w:name w:val="Table Grid"/>
     <w:basedOn w:val="TableNormal"/>
+    <w:uiPriority w:val="59"/>
     <w:rsid w:val="008435F1"/>
     <w:tblPr>
       <w:tblBorders>

</xml_diff>